<commit_message>
docs: stop table rows splitting across a page break
"Support Vector Machine" is tall enough to wrap onto three lines, and Word was breaking
the row itself across the page boundary. The result was the model name split in half
with an empty continuation row on the next page, which reads as a seventh model with no
numbers in it.

Every row in all three tables now carries cantSplit, so a row moves to the next page
whole rather than being cut. Header rows already repeat, so a table spanning a break
still shows its column labels.
</commit_message>
<xml_diff>
--- a/docs/NLP Final Report - Group 02 Section B.docx
+++ b/docs/NLP Final Report - Group 02 Section B.docx
@@ -1300,6 +1300,7 @@
       <w:tr>
         <w:trPr>
           <w:tblHeader w:val="true"/>
+          <w:cantSplit w:val="true"/>
         </w:trPr>
         <w:tc>
           <w:tcPr>
@@ -1385,6 +1386,7 @@
       <w:tr>
         <w:trPr>
           <w:tblHeader w:val="true"/>
+          <w:cantSplit w:val="true"/>
         </w:trPr>
         <w:tc>
           <w:tcPr>
@@ -1562,6 +1564,9 @@
         </w:tc>
       </w:tr>
       <w:tr>
+        <w:trPr>
+          <w:cantSplit w:val="true"/>
+        </w:trPr>
         <w:tc>
           <w:tcPr>
             <w:tcW w:type="dxa" w:w="903"/>
@@ -1764,6 +1769,9 @@
         </w:tc>
       </w:tr>
       <w:tr>
+        <w:trPr>
+          <w:cantSplit w:val="true"/>
+        </w:trPr>
         <w:tc>
           <w:tcPr>
             <w:tcW w:type="dxa" w:w="903"/>
@@ -1953,6 +1961,9 @@
         </w:tc>
       </w:tr>
       <w:tr>
+        <w:trPr>
+          <w:cantSplit w:val="true"/>
+        </w:trPr>
         <w:tc>
           <w:tcPr>
             <w:tcW w:type="dxa" w:w="903"/>
@@ -2155,6 +2166,9 @@
         </w:tc>
       </w:tr>
       <w:tr>
+        <w:trPr>
+          <w:cantSplit w:val="true"/>
+        </w:trPr>
         <w:tc>
           <w:tcPr>
             <w:tcW w:type="dxa" w:w="903"/>
@@ -2344,6 +2358,9 @@
         </w:tc>
       </w:tr>
       <w:tr>
+        <w:trPr>
+          <w:cantSplit w:val="true"/>
+        </w:trPr>
         <w:tc>
           <w:tcPr>
             <w:tcW w:type="dxa" w:w="903"/>
@@ -2546,6 +2563,9 @@
         </w:tc>
       </w:tr>
       <w:tr>
+        <w:trPr>
+          <w:cantSplit w:val="true"/>
+        </w:trPr>
         <w:tc>
           <w:tcPr>
             <w:tcW w:type="dxa" w:w="903"/>
@@ -2912,6 +2932,7 @@
       <w:tr>
         <w:trPr>
           <w:tblHeader w:val="true"/>
+          <w:cantSplit w:val="true"/>
         </w:trPr>
         <w:tc>
           <w:tcPr>
@@ -3037,6 +3058,7 @@
       <w:tr>
         <w:trPr>
           <w:tblHeader w:val="true"/>
+          <w:cantSplit w:val="true"/>
         </w:trPr>
         <w:tc>
           <w:tcPr>
@@ -3228,6 +3250,9 @@
         </w:tc>
       </w:tr>
       <w:tr>
+        <w:trPr>
+          <w:cantSplit w:val="true"/>
+        </w:trPr>
         <w:tc>
           <w:tcPr>
             <w:tcW w:type="dxa" w:w="752"/>
@@ -3470,6 +3495,9 @@
         </w:tc>
       </w:tr>
       <w:tr>
+        <w:trPr>
+          <w:cantSplit w:val="true"/>
+        </w:trPr>
         <w:tc>
           <w:tcPr>
             <w:tcW w:type="dxa" w:w="752"/>
@@ -3699,6 +3727,9 @@
         </w:tc>
       </w:tr>
       <w:tr>
+        <w:trPr>
+          <w:cantSplit w:val="true"/>
+        </w:trPr>
         <w:tc>
           <w:tcPr>
             <w:tcW w:type="dxa" w:w="752"/>
@@ -3928,6 +3959,9 @@
         </w:tc>
       </w:tr>
       <w:tr>
+        <w:trPr>
+          <w:cantSplit w:val="true"/>
+        </w:trPr>
         <w:tc>
           <w:tcPr>
             <w:tcW w:type="dxa" w:w="752"/>
@@ -4157,6 +4191,9 @@
         </w:tc>
       </w:tr>
       <w:tr>
+        <w:trPr>
+          <w:cantSplit w:val="true"/>
+        </w:trPr>
         <w:tc>
           <w:tcPr>
             <w:tcW w:type="dxa" w:w="752"/>
@@ -4386,6 +4423,9 @@
         </w:tc>
       </w:tr>
       <w:tr>
+        <w:trPr>
+          <w:cantSplit w:val="true"/>
+        </w:trPr>
         <w:tc>
           <w:tcPr>
             <w:tcW w:type="dxa" w:w="752"/>
@@ -4615,6 +4655,9 @@
         </w:tc>
       </w:tr>
       <w:tr>
+        <w:trPr>
+          <w:cantSplit w:val="true"/>
+        </w:trPr>
         <w:tc>
           <w:tcPr>
             <w:tcW w:type="dxa" w:w="752"/>
@@ -4844,6 +4887,9 @@
         </w:tc>
       </w:tr>
       <w:tr>
+        <w:trPr>
+          <w:cantSplit w:val="true"/>
+        </w:trPr>
         <w:tc>
           <w:tcPr>
             <w:tcW w:type="dxa" w:w="752"/>
@@ -5073,6 +5119,9 @@
         </w:tc>
       </w:tr>
       <w:tr>
+        <w:trPr>
+          <w:cantSplit w:val="true"/>
+        </w:trPr>
         <w:tc>
           <w:tcPr>
             <w:tcW w:type="dxa" w:w="752"/>
@@ -5317,6 +5366,9 @@
         </w:tc>
       </w:tr>
       <w:tr>
+        <w:trPr>
+          <w:cantSplit w:val="true"/>
+        </w:trPr>
         <w:tc>
           <w:tcPr>
             <w:tcW w:type="dxa" w:w="752"/>
@@ -5546,6 +5598,9 @@
         </w:tc>
       </w:tr>
       <w:tr>
+        <w:trPr>
+          <w:cantSplit w:val="true"/>
+        </w:trPr>
         <w:tc>
           <w:tcPr>
             <w:tcW w:type="dxa" w:w="752"/>
@@ -5775,6 +5830,9 @@
         </w:tc>
       </w:tr>
       <w:tr>
+        <w:trPr>
+          <w:cantSplit w:val="true"/>
+        </w:trPr>
         <w:tc>
           <w:tcPr>
             <w:tcW w:type="dxa" w:w="752"/>
@@ -6004,6 +6062,9 @@
         </w:tc>
       </w:tr>
       <w:tr>
+        <w:trPr>
+          <w:cantSplit w:val="true"/>
+        </w:trPr>
         <w:tc>
           <w:tcPr>
             <w:tcW w:type="dxa" w:w="752"/>
@@ -6233,6 +6294,9 @@
         </w:tc>
       </w:tr>
       <w:tr>
+        <w:trPr>
+          <w:cantSplit w:val="true"/>
+        </w:trPr>
         <w:tc>
           <w:tcPr>
             <w:tcW w:type="dxa" w:w="752"/>
@@ -6462,6 +6526,9 @@
         </w:tc>
       </w:tr>
       <w:tr>
+        <w:trPr>
+          <w:cantSplit w:val="true"/>
+        </w:trPr>
         <w:tc>
           <w:tcPr>
             <w:tcW w:type="dxa" w:w="752"/>
@@ -6691,6 +6758,9 @@
         </w:tc>
       </w:tr>
       <w:tr>
+        <w:trPr>
+          <w:cantSplit w:val="true"/>
+        </w:trPr>
         <w:tc>
           <w:tcPr>
             <w:tcW w:type="dxa" w:w="752"/>
@@ -6920,6 +6990,9 @@
         </w:tc>
       </w:tr>
       <w:tr>
+        <w:trPr>
+          <w:cantSplit w:val="true"/>
+        </w:trPr>
         <w:tc>
           <w:tcPr>
             <w:tcW w:type="dxa" w:w="752"/>
@@ -7490,6 +7563,7 @@
       <w:tr>
         <w:trPr>
           <w:tblHeader w:val="true"/>
+          <w:cantSplit w:val="true"/>
         </w:trPr>
         <w:tc>
           <w:tcPr>
@@ -7555,6 +7629,7 @@
       <w:tr>
         <w:trPr>
           <w:tblHeader w:val="true"/>
+          <w:cantSplit w:val="true"/>
         </w:trPr>
         <w:tc>
           <w:tcPr>
@@ -7765,6 +7840,9 @@
         </w:tc>
       </w:tr>
       <w:tr>
+        <w:trPr>
+          <w:cantSplit w:val="true"/>
+        </w:trPr>
         <w:tc>
           <w:tcPr>
             <w:tcW w:type="dxa" w:w="821"/>
@@ -7987,6 +8065,9 @@
         </w:tc>
       </w:tr>
       <w:tr>
+        <w:trPr>
+          <w:cantSplit w:val="true"/>
+        </w:trPr>
         <w:tc>
           <w:tcPr>
             <w:tcW w:type="dxa" w:w="821"/>
@@ -8209,6 +8290,9 @@
         </w:tc>
       </w:tr>
       <w:tr>
+        <w:trPr>
+          <w:cantSplit w:val="true"/>
+        </w:trPr>
         <w:tc>
           <w:tcPr>
             <w:tcW w:type="dxa" w:w="821"/>
@@ -8431,6 +8515,9 @@
         </w:tc>
       </w:tr>
       <w:tr>
+        <w:trPr>
+          <w:cantSplit w:val="true"/>
+        </w:trPr>
         <w:tc>
           <w:tcPr>
             <w:tcW w:type="dxa" w:w="821"/>
@@ -8653,6 +8740,9 @@
         </w:tc>
       </w:tr>
       <w:tr>
+        <w:trPr>
+          <w:cantSplit w:val="true"/>
+        </w:trPr>
         <w:tc>
           <w:tcPr>
             <w:tcW w:type="dxa" w:w="821"/>
@@ -8875,6 +8965,9 @@
         </w:tc>
       </w:tr>
       <w:tr>
+        <w:trPr>
+          <w:cantSplit w:val="true"/>
+        </w:trPr>
         <w:tc>
           <w:tcPr>
             <w:tcW w:type="dxa" w:w="821"/>

</xml_diff>

<commit_message>
docs: add the instructor's two-table layout to Overall Result Analysis
Section 6 was showing only the final best-of comparison. Per the
course template's own Overall Result Analysis tables, it also needs
the full BERT/DeBERTa/ensemble sweep grid alongside it. That grid is
now Table 6, and the final comparison shifts to Table 7.
</commit_message>
<xml_diff>
--- a/docs/NLP Final Report - Group 02 Section B.docx
+++ b/docs/NLP Final Report - Group 02 Section B.docx
@@ -9279,7 +9279,7 @@
           <w:b w:val="0"/>
           <w:sz w:val="24"/>
         </w:rPr>
-        <w:t>Table 6 brings everything together in the form the project specification asks for. Every row comes from the full balanced corpora and the same fixed split. Each classical row is shown with whichever of the two text representations worked better on that dataset, which the Rep. column names. The transformers read raw text, so no representation applies to them.</w:t>
+        <w:t>Table 6 repeats the full BERT and DeBERTa hyperparameter sweep alongside the ensemble, so every configuration behind the headline comparison is visible in one place rather than split across the two sections above. Table 7 then brings everything together in the form the project specification asks for. Every row comes from the full balanced corpora and the same fixed split. Each classical row is shown with whichever of the two text representations worked better on that dataset, which the Rep. column names. The transformers read raw text, so no representation applies to them.</w:t>
       </w:r>
     </w:p>
     <w:p>
@@ -9344,7 +9344,4306 @@
           <w:b w:val="0"/>
           <w:sz w:val="20"/>
         </w:rPr>
-        <w:t>Table 6. Final comparison. Every row comes from the full balanced corpora and the same fixed split. Each classical row is shown with whichever text representation performed better on that dataset, which the Rep. column names. The transformers read raw text, so no representation applies to them. The ENSEMBLE row uses the weight chosen on validation.</w:t>
+        <w:t>Table 6. BERT, DeBERTa and ensemble results across the full hyperparameter sweep, full balanced corpora, evaluated on the test split.</w:t>
+      </w:r>
+    </w:p>
+    <w:tbl>
+      <w:tblPr>
+        <w:tblStyle w:val="TableGrid"/>
+        <w:tblW w:type="auto" w:w="0"/>
+        <w:jc w:val="center"/>
+        <w:tblLook w:firstColumn="1" w:firstRow="1" w:lastColumn="0" w:lastRow="0" w:noHBand="0" w:noVBand="1" w:val="04A0"/>
+      </w:tblPr>
+      <w:tblGrid>
+        <w:gridCol w:w="752"/>
+        <w:gridCol w:w="752"/>
+        <w:gridCol w:w="752"/>
+        <w:gridCol w:w="752"/>
+        <w:gridCol w:w="752"/>
+        <w:gridCol w:w="752"/>
+        <w:gridCol w:w="752"/>
+        <w:gridCol w:w="752"/>
+        <w:gridCol w:w="752"/>
+        <w:gridCol w:w="752"/>
+        <w:gridCol w:w="752"/>
+        <w:gridCol w:w="752"/>
+      </w:tblGrid>
+      <w:tr>
+        <w:trPr>
+          <w:tblHeader w:val="true"/>
+          <w:cantSplit w:val="true"/>
+        </w:trPr>
+        <w:tc>
+          <w:tcPr>
+            <w:tcW w:type="dxa" w:w="752"/>
+            <w:vMerge w:val="restart"/>
+          </w:tcPr>
+          <w:p>
+            <w:pPr>
+              <w:spacing w:before="20" w:after="20"/>
+              <w:jc w:val="center"/>
+            </w:pPr>
+            <w:r>
+              <w:rPr>
+                <w:rFonts w:ascii="Times New Roman" w:hAnsi="Times New Roman" w:eastAsia="Times New Roman"/>
+                <w:b/>
+                <w:sz w:val="13"/>
+              </w:rPr>
+              <w:t>Model</w:t>
+            </w:r>
+          </w:p>
+        </w:tc>
+        <w:tc>
+          <w:tcPr>
+            <w:tcW w:type="dxa" w:w="752"/>
+            <w:vMerge w:val="restart"/>
+          </w:tcPr>
+          <w:p>
+            <w:pPr>
+              <w:spacing w:before="20" w:after="20"/>
+              <w:jc w:val="center"/>
+            </w:pPr>
+            <w:r>
+              <w:rPr>
+                <w:rFonts w:ascii="Times New Roman" w:hAnsi="Times New Roman" w:eastAsia="Times New Roman"/>
+                <w:b/>
+                <w:sz w:val="13"/>
+              </w:rPr>
+              <w:t>Learning Rate</w:t>
+            </w:r>
+          </w:p>
+        </w:tc>
+        <w:tc>
+          <w:tcPr>
+            <w:tcW w:type="dxa" w:w="752"/>
+            <w:vMerge w:val="restart"/>
+          </w:tcPr>
+          <w:p>
+            <w:pPr>
+              <w:spacing w:before="20" w:after="20"/>
+              <w:jc w:val="center"/>
+            </w:pPr>
+            <w:r>
+              <w:rPr>
+                <w:rFonts w:ascii="Times New Roman" w:hAnsi="Times New Roman" w:eastAsia="Times New Roman"/>
+                <w:b/>
+                <w:sz w:val="13"/>
+              </w:rPr>
+              <w:t>Batch Size</w:t>
+            </w:r>
+          </w:p>
+        </w:tc>
+        <w:tc>
+          <w:tcPr>
+            <w:tcW w:type="dxa" w:w="752"/>
+            <w:vMerge w:val="restart"/>
+          </w:tcPr>
+          <w:p>
+            <w:pPr>
+              <w:spacing w:before="20" w:after="20"/>
+              <w:jc w:val="center"/>
+            </w:pPr>
+            <w:r>
+              <w:rPr>
+                <w:rFonts w:ascii="Times New Roman" w:hAnsi="Times New Roman" w:eastAsia="Times New Roman"/>
+                <w:b/>
+                <w:sz w:val="13"/>
+              </w:rPr>
+              <w:t>Weight Decay</w:t>
+            </w:r>
+          </w:p>
+        </w:tc>
+        <w:tc>
+          <w:tcPr>
+            <w:tcW w:type="dxa" w:w="3008"/>
+            <w:gridSpan w:val="4"/>
+          </w:tcPr>
+          <w:p>
+            <w:pPr>
+              <w:spacing w:before="20" w:after="20"/>
+              <w:jc w:val="center"/>
+            </w:pPr>
+            <w:r>
+              <w:rPr>
+                <w:rFonts w:ascii="Times New Roman" w:hAnsi="Times New Roman" w:eastAsia="Times New Roman"/>
+                <w:b/>
+                <w:sz w:val="13"/>
+              </w:rPr>
+              <w:t>Dataset 1 (DAIGT V2)</w:t>
+            </w:r>
+          </w:p>
+        </w:tc>
+        <w:tc>
+          <w:tcPr>
+            <w:tcW w:type="dxa" w:w="3008"/>
+            <w:gridSpan w:val="4"/>
+          </w:tcPr>
+          <w:p>
+            <w:pPr>
+              <w:spacing w:before="20" w:after="20"/>
+              <w:jc w:val="center"/>
+            </w:pPr>
+            <w:r>
+              <w:rPr>
+                <w:rFonts w:ascii="Times New Roman" w:hAnsi="Times New Roman" w:eastAsia="Times New Roman"/>
+                <w:b/>
+                <w:sz w:val="13"/>
+              </w:rPr>
+              <w:t>Dataset 2 (HC3)</w:t>
+            </w:r>
+          </w:p>
+        </w:tc>
+      </w:tr>
+      <w:tr>
+        <w:trPr>
+          <w:tblHeader w:val="true"/>
+          <w:cantSplit w:val="true"/>
+        </w:trPr>
+        <w:tc>
+          <w:tcPr>
+            <w:tcW w:type="dxa" w:w="752"/>
+            <w:vMerge/>
+          </w:tcPr>
+          <w:p/>
+        </w:tc>
+        <w:tc>
+          <w:tcPr>
+            <w:tcW w:type="dxa" w:w="752"/>
+            <w:vMerge/>
+          </w:tcPr>
+          <w:p/>
+        </w:tc>
+        <w:tc>
+          <w:tcPr>
+            <w:tcW w:type="dxa" w:w="752"/>
+            <w:vMerge/>
+          </w:tcPr>
+          <w:p/>
+        </w:tc>
+        <w:tc>
+          <w:tcPr>
+            <w:tcW w:type="dxa" w:w="752"/>
+            <w:vMerge/>
+          </w:tcPr>
+          <w:p/>
+        </w:tc>
+        <w:tc>
+          <w:tcPr>
+            <w:tcW w:type="dxa" w:w="752"/>
+          </w:tcPr>
+          <w:p>
+            <w:pPr>
+              <w:spacing w:before="20" w:after="20"/>
+              <w:jc w:val="center"/>
+            </w:pPr>
+            <w:r/>
+            <w:r>
+              <w:rPr>
+                <w:rFonts w:ascii="Times New Roman" w:hAnsi="Times New Roman" w:eastAsia="Times New Roman"/>
+                <w:b/>
+                <w:sz w:val="13"/>
+              </w:rPr>
+              <w:t>Acc</w:t>
+            </w:r>
+          </w:p>
+        </w:tc>
+        <w:tc>
+          <w:tcPr>
+            <w:tcW w:type="dxa" w:w="752"/>
+          </w:tcPr>
+          <w:p>
+            <w:pPr>
+              <w:spacing w:before="20" w:after="20"/>
+              <w:jc w:val="center"/>
+            </w:pPr>
+            <w:r/>
+            <w:r>
+              <w:rPr>
+                <w:rFonts w:ascii="Times New Roman" w:hAnsi="Times New Roman" w:eastAsia="Times New Roman"/>
+                <w:b/>
+                <w:sz w:val="13"/>
+              </w:rPr>
+              <w:t>Prec</w:t>
+            </w:r>
+          </w:p>
+        </w:tc>
+        <w:tc>
+          <w:tcPr>
+            <w:tcW w:type="dxa" w:w="752"/>
+          </w:tcPr>
+          <w:p>
+            <w:pPr>
+              <w:spacing w:before="20" w:after="20"/>
+              <w:jc w:val="center"/>
+            </w:pPr>
+            <w:r/>
+            <w:r>
+              <w:rPr>
+                <w:rFonts w:ascii="Times New Roman" w:hAnsi="Times New Roman" w:eastAsia="Times New Roman"/>
+                <w:b/>
+                <w:sz w:val="13"/>
+              </w:rPr>
+              <w:t>Rec</w:t>
+            </w:r>
+          </w:p>
+        </w:tc>
+        <w:tc>
+          <w:tcPr>
+            <w:tcW w:type="dxa" w:w="752"/>
+          </w:tcPr>
+          <w:p>
+            <w:pPr>
+              <w:spacing w:before="20" w:after="20"/>
+              <w:jc w:val="center"/>
+            </w:pPr>
+            <w:r/>
+            <w:r>
+              <w:rPr>
+                <w:rFonts w:ascii="Times New Roman" w:hAnsi="Times New Roman" w:eastAsia="Times New Roman"/>
+                <w:b/>
+                <w:sz w:val="13"/>
+              </w:rPr>
+              <w:t>F1</w:t>
+            </w:r>
+          </w:p>
+        </w:tc>
+        <w:tc>
+          <w:tcPr>
+            <w:tcW w:type="dxa" w:w="752"/>
+          </w:tcPr>
+          <w:p>
+            <w:pPr>
+              <w:spacing w:before="20" w:after="20"/>
+              <w:jc w:val="center"/>
+            </w:pPr>
+            <w:r/>
+            <w:r>
+              <w:rPr>
+                <w:rFonts w:ascii="Times New Roman" w:hAnsi="Times New Roman" w:eastAsia="Times New Roman"/>
+                <w:b/>
+                <w:sz w:val="13"/>
+              </w:rPr>
+              <w:t>Acc</w:t>
+            </w:r>
+          </w:p>
+        </w:tc>
+        <w:tc>
+          <w:tcPr>
+            <w:tcW w:type="dxa" w:w="752"/>
+          </w:tcPr>
+          <w:p>
+            <w:pPr>
+              <w:spacing w:before="20" w:after="20"/>
+              <w:jc w:val="center"/>
+            </w:pPr>
+            <w:r/>
+            <w:r>
+              <w:rPr>
+                <w:rFonts w:ascii="Times New Roman" w:hAnsi="Times New Roman" w:eastAsia="Times New Roman"/>
+                <w:b/>
+                <w:sz w:val="13"/>
+              </w:rPr>
+              <w:t>Prec</w:t>
+            </w:r>
+          </w:p>
+        </w:tc>
+        <w:tc>
+          <w:tcPr>
+            <w:tcW w:type="dxa" w:w="752"/>
+          </w:tcPr>
+          <w:p>
+            <w:pPr>
+              <w:spacing w:before="20" w:after="20"/>
+              <w:jc w:val="center"/>
+            </w:pPr>
+            <w:r/>
+            <w:r>
+              <w:rPr>
+                <w:rFonts w:ascii="Times New Roman" w:hAnsi="Times New Roman" w:eastAsia="Times New Roman"/>
+                <w:b/>
+                <w:sz w:val="13"/>
+              </w:rPr>
+              <w:t>Rec</w:t>
+            </w:r>
+          </w:p>
+        </w:tc>
+        <w:tc>
+          <w:tcPr>
+            <w:tcW w:type="dxa" w:w="752"/>
+          </w:tcPr>
+          <w:p>
+            <w:pPr>
+              <w:spacing w:before="20" w:after="20"/>
+              <w:jc w:val="center"/>
+            </w:pPr>
+            <w:r/>
+            <w:r>
+              <w:rPr>
+                <w:rFonts w:ascii="Times New Roman" w:hAnsi="Times New Roman" w:eastAsia="Times New Roman"/>
+                <w:b/>
+                <w:sz w:val="13"/>
+              </w:rPr>
+              <w:t>F1</w:t>
+            </w:r>
+          </w:p>
+        </w:tc>
+      </w:tr>
+      <w:tr>
+        <w:trPr>
+          <w:cantSplit w:val="true"/>
+        </w:trPr>
+        <w:tc>
+          <w:tcPr>
+            <w:tcW w:type="dxa" w:w="752"/>
+            <w:vMerge w:val="restart"/>
+          </w:tcPr>
+          <w:p>
+            <w:pPr>
+              <w:spacing w:before="20" w:after="20"/>
+              <w:jc w:val="center"/>
+            </w:pPr>
+            <w:r>
+              <w:rPr>
+                <w:rFonts w:ascii="Times New Roman" w:hAnsi="Times New Roman" w:eastAsia="Times New Roman"/>
+                <w:b w:val="0"/>
+                <w:sz w:val="13"/>
+              </w:rPr>
+              <w:t>BERT</w:t>
+            </w:r>
+          </w:p>
+        </w:tc>
+        <w:tc>
+          <w:tcPr>
+            <w:tcW w:type="dxa" w:w="752"/>
+          </w:tcPr>
+          <w:p>
+            <w:pPr>
+              <w:spacing w:before="20" w:after="20"/>
+              <w:jc w:val="center"/>
+            </w:pPr>
+            <w:r/>
+            <w:r>
+              <w:rPr>
+                <w:rFonts w:ascii="Times New Roman" w:hAnsi="Times New Roman" w:eastAsia="Times New Roman"/>
+                <w:b w:val="0"/>
+                <w:sz w:val="13"/>
+              </w:rPr>
+              <w:t>0.00002</w:t>
+            </w:r>
+          </w:p>
+        </w:tc>
+        <w:tc>
+          <w:tcPr>
+            <w:tcW w:type="dxa" w:w="752"/>
+          </w:tcPr>
+          <w:p>
+            <w:pPr>
+              <w:spacing w:before="20" w:after="20"/>
+              <w:jc w:val="center"/>
+            </w:pPr>
+            <w:r/>
+            <w:r>
+              <w:rPr>
+                <w:rFonts w:ascii="Times New Roman" w:hAnsi="Times New Roman" w:eastAsia="Times New Roman"/>
+                <w:b w:val="0"/>
+                <w:sz w:val="13"/>
+              </w:rPr>
+              <w:t>16</w:t>
+            </w:r>
+          </w:p>
+        </w:tc>
+        <w:tc>
+          <w:tcPr>
+            <w:tcW w:type="dxa" w:w="752"/>
+          </w:tcPr>
+          <w:p>
+            <w:pPr>
+              <w:spacing w:before="20" w:after="20"/>
+              <w:jc w:val="center"/>
+            </w:pPr>
+            <w:r/>
+            <w:r>
+              <w:rPr>
+                <w:rFonts w:ascii="Times New Roman" w:hAnsi="Times New Roman" w:eastAsia="Times New Roman"/>
+                <w:b w:val="0"/>
+                <w:sz w:val="13"/>
+              </w:rPr>
+              <w:t>0.01</w:t>
+            </w:r>
+          </w:p>
+        </w:tc>
+        <w:tc>
+          <w:tcPr>
+            <w:tcW w:type="dxa" w:w="752"/>
+          </w:tcPr>
+          <w:p>
+            <w:pPr>
+              <w:spacing w:before="20" w:after="20"/>
+              <w:jc w:val="center"/>
+            </w:pPr>
+            <w:r/>
+            <w:r>
+              <w:rPr>
+                <w:rFonts w:ascii="Times New Roman" w:hAnsi="Times New Roman" w:eastAsia="Times New Roman"/>
+                <w:b w:val="0"/>
+                <w:sz w:val="13"/>
+              </w:rPr>
+              <w:t>0.9920</w:t>
+            </w:r>
+          </w:p>
+        </w:tc>
+        <w:tc>
+          <w:tcPr>
+            <w:tcW w:type="dxa" w:w="752"/>
+          </w:tcPr>
+          <w:p>
+            <w:pPr>
+              <w:spacing w:before="20" w:after="20"/>
+              <w:jc w:val="center"/>
+            </w:pPr>
+            <w:r/>
+            <w:r>
+              <w:rPr>
+                <w:rFonts w:ascii="Times New Roman" w:hAnsi="Times New Roman" w:eastAsia="Times New Roman"/>
+                <w:b w:val="0"/>
+                <w:sz w:val="13"/>
+              </w:rPr>
+              <w:t>0.9920</w:t>
+            </w:r>
+          </w:p>
+        </w:tc>
+        <w:tc>
+          <w:tcPr>
+            <w:tcW w:type="dxa" w:w="752"/>
+          </w:tcPr>
+          <w:p>
+            <w:pPr>
+              <w:spacing w:before="20" w:after="20"/>
+              <w:jc w:val="center"/>
+            </w:pPr>
+            <w:r/>
+            <w:r>
+              <w:rPr>
+                <w:rFonts w:ascii="Times New Roman" w:hAnsi="Times New Roman" w:eastAsia="Times New Roman"/>
+                <w:b w:val="0"/>
+                <w:sz w:val="13"/>
+              </w:rPr>
+              <w:t>0.9920</w:t>
+            </w:r>
+          </w:p>
+        </w:tc>
+        <w:tc>
+          <w:tcPr>
+            <w:tcW w:type="dxa" w:w="752"/>
+          </w:tcPr>
+          <w:p>
+            <w:pPr>
+              <w:spacing w:before="20" w:after="20"/>
+              <w:jc w:val="center"/>
+            </w:pPr>
+            <w:r/>
+            <w:r>
+              <w:rPr>
+                <w:rFonts w:ascii="Times New Roman" w:hAnsi="Times New Roman" w:eastAsia="Times New Roman"/>
+                <w:b w:val="0"/>
+                <w:sz w:val="13"/>
+              </w:rPr>
+              <w:t>0.9920</w:t>
+            </w:r>
+          </w:p>
+        </w:tc>
+        <w:tc>
+          <w:tcPr>
+            <w:tcW w:type="dxa" w:w="752"/>
+          </w:tcPr>
+          <w:p>
+            <w:pPr>
+              <w:spacing w:before="20" w:after="20"/>
+              <w:jc w:val="center"/>
+            </w:pPr>
+            <w:r/>
+            <w:r>
+              <w:rPr>
+                <w:rFonts w:ascii="Times New Roman" w:hAnsi="Times New Roman" w:eastAsia="Times New Roman"/>
+                <w:b w:val="0"/>
+                <w:sz w:val="13"/>
+              </w:rPr>
+              <w:t>0.9910</w:t>
+            </w:r>
+          </w:p>
+        </w:tc>
+        <w:tc>
+          <w:tcPr>
+            <w:tcW w:type="dxa" w:w="752"/>
+          </w:tcPr>
+          <w:p>
+            <w:pPr>
+              <w:spacing w:before="20" w:after="20"/>
+              <w:jc w:val="center"/>
+            </w:pPr>
+            <w:r/>
+            <w:r>
+              <w:rPr>
+                <w:rFonts w:ascii="Times New Roman" w:hAnsi="Times New Roman" w:eastAsia="Times New Roman"/>
+                <w:b w:val="0"/>
+                <w:sz w:val="13"/>
+              </w:rPr>
+              <w:t>0.9911</w:t>
+            </w:r>
+          </w:p>
+        </w:tc>
+        <w:tc>
+          <w:tcPr>
+            <w:tcW w:type="dxa" w:w="752"/>
+          </w:tcPr>
+          <w:p>
+            <w:pPr>
+              <w:spacing w:before="20" w:after="20"/>
+              <w:jc w:val="center"/>
+            </w:pPr>
+            <w:r/>
+            <w:r>
+              <w:rPr>
+                <w:rFonts w:ascii="Times New Roman" w:hAnsi="Times New Roman" w:eastAsia="Times New Roman"/>
+                <w:b w:val="0"/>
+                <w:sz w:val="13"/>
+              </w:rPr>
+              <w:t>0.9910</w:t>
+            </w:r>
+          </w:p>
+        </w:tc>
+        <w:tc>
+          <w:tcPr>
+            <w:tcW w:type="dxa" w:w="752"/>
+          </w:tcPr>
+          <w:p>
+            <w:pPr>
+              <w:spacing w:before="20" w:after="20"/>
+              <w:jc w:val="center"/>
+            </w:pPr>
+            <w:r/>
+            <w:r>
+              <w:rPr>
+                <w:rFonts w:ascii="Times New Roman" w:hAnsi="Times New Roman" w:eastAsia="Times New Roman"/>
+                <w:b w:val="0"/>
+                <w:sz w:val="13"/>
+              </w:rPr>
+              <w:t>0.9910</w:t>
+            </w:r>
+          </w:p>
+        </w:tc>
+      </w:tr>
+      <w:tr>
+        <w:trPr>
+          <w:cantSplit w:val="true"/>
+        </w:trPr>
+        <w:tc>
+          <w:tcPr>
+            <w:tcW w:type="dxa" w:w="752"/>
+            <w:vMerge/>
+          </w:tcPr>
+          <w:p/>
+        </w:tc>
+        <w:tc>
+          <w:tcPr>
+            <w:tcW w:type="dxa" w:w="752"/>
+          </w:tcPr>
+          <w:p>
+            <w:pPr>
+              <w:spacing w:before="20" w:after="20"/>
+              <w:jc w:val="center"/>
+            </w:pPr>
+            <w:r/>
+            <w:r>
+              <w:rPr>
+                <w:rFonts w:ascii="Times New Roman" w:hAnsi="Times New Roman" w:eastAsia="Times New Roman"/>
+                <w:b w:val="0"/>
+                <w:sz w:val="13"/>
+              </w:rPr>
+              <w:t>0.00003</w:t>
+            </w:r>
+          </w:p>
+        </w:tc>
+        <w:tc>
+          <w:tcPr>
+            <w:tcW w:type="dxa" w:w="752"/>
+          </w:tcPr>
+          <w:p>
+            <w:pPr>
+              <w:spacing w:before="20" w:after="20"/>
+              <w:jc w:val="center"/>
+            </w:pPr>
+            <w:r/>
+            <w:r>
+              <w:rPr>
+                <w:rFonts w:ascii="Times New Roman" w:hAnsi="Times New Roman" w:eastAsia="Times New Roman"/>
+                <w:b w:val="0"/>
+                <w:sz w:val="13"/>
+              </w:rPr>
+              <w:t>16</w:t>
+            </w:r>
+          </w:p>
+        </w:tc>
+        <w:tc>
+          <w:tcPr>
+            <w:tcW w:type="dxa" w:w="752"/>
+          </w:tcPr>
+          <w:p>
+            <w:pPr>
+              <w:spacing w:before="20" w:after="20"/>
+              <w:jc w:val="center"/>
+            </w:pPr>
+            <w:r/>
+            <w:r>
+              <w:rPr>
+                <w:rFonts w:ascii="Times New Roman" w:hAnsi="Times New Roman" w:eastAsia="Times New Roman"/>
+                <w:b w:val="0"/>
+                <w:sz w:val="13"/>
+              </w:rPr>
+              <w:t>0.01</w:t>
+            </w:r>
+          </w:p>
+        </w:tc>
+        <w:tc>
+          <w:tcPr>
+            <w:tcW w:type="dxa" w:w="752"/>
+          </w:tcPr>
+          <w:p>
+            <w:pPr>
+              <w:spacing w:before="20" w:after="20"/>
+              <w:jc w:val="center"/>
+            </w:pPr>
+            <w:r/>
+            <w:r>
+              <w:rPr>
+                <w:rFonts w:ascii="Times New Roman" w:hAnsi="Times New Roman" w:eastAsia="Times New Roman"/>
+                <w:b w:val="0"/>
+                <w:sz w:val="13"/>
+              </w:rPr>
+              <w:t>0.9954</w:t>
+            </w:r>
+          </w:p>
+        </w:tc>
+        <w:tc>
+          <w:tcPr>
+            <w:tcW w:type="dxa" w:w="752"/>
+          </w:tcPr>
+          <w:p>
+            <w:pPr>
+              <w:spacing w:before="20" w:after="20"/>
+              <w:jc w:val="center"/>
+            </w:pPr>
+            <w:r/>
+            <w:r>
+              <w:rPr>
+                <w:rFonts w:ascii="Times New Roman" w:hAnsi="Times New Roman" w:eastAsia="Times New Roman"/>
+                <w:b w:val="0"/>
+                <w:sz w:val="13"/>
+              </w:rPr>
+              <w:t>0.9954</w:t>
+            </w:r>
+          </w:p>
+        </w:tc>
+        <w:tc>
+          <w:tcPr>
+            <w:tcW w:type="dxa" w:w="752"/>
+          </w:tcPr>
+          <w:p>
+            <w:pPr>
+              <w:spacing w:before="20" w:after="20"/>
+              <w:jc w:val="center"/>
+            </w:pPr>
+            <w:r/>
+            <w:r>
+              <w:rPr>
+                <w:rFonts w:ascii="Times New Roman" w:hAnsi="Times New Roman" w:eastAsia="Times New Roman"/>
+                <w:b w:val="0"/>
+                <w:sz w:val="13"/>
+              </w:rPr>
+              <w:t>0.9954</w:t>
+            </w:r>
+          </w:p>
+        </w:tc>
+        <w:tc>
+          <w:tcPr>
+            <w:tcW w:type="dxa" w:w="752"/>
+          </w:tcPr>
+          <w:p>
+            <w:pPr>
+              <w:spacing w:before="20" w:after="20"/>
+              <w:jc w:val="center"/>
+            </w:pPr>
+            <w:r/>
+            <w:r>
+              <w:rPr>
+                <w:rFonts w:ascii="Times New Roman" w:hAnsi="Times New Roman" w:eastAsia="Times New Roman"/>
+                <w:b w:val="0"/>
+                <w:sz w:val="13"/>
+              </w:rPr>
+              <w:t>0.9954</w:t>
+            </w:r>
+          </w:p>
+        </w:tc>
+        <w:tc>
+          <w:tcPr>
+            <w:tcW w:type="dxa" w:w="752"/>
+          </w:tcPr>
+          <w:p>
+            <w:pPr>
+              <w:spacing w:before="20" w:after="20"/>
+              <w:jc w:val="center"/>
+            </w:pPr>
+            <w:r/>
+            <w:r>
+              <w:rPr>
+                <w:rFonts w:ascii="Times New Roman" w:hAnsi="Times New Roman" w:eastAsia="Times New Roman"/>
+                <w:b w:val="0"/>
+                <w:sz w:val="13"/>
+              </w:rPr>
+              <w:t>0.9940</w:t>
+            </w:r>
+          </w:p>
+        </w:tc>
+        <w:tc>
+          <w:tcPr>
+            <w:tcW w:type="dxa" w:w="752"/>
+          </w:tcPr>
+          <w:p>
+            <w:pPr>
+              <w:spacing w:before="20" w:after="20"/>
+              <w:jc w:val="center"/>
+            </w:pPr>
+            <w:r/>
+            <w:r>
+              <w:rPr>
+                <w:rFonts w:ascii="Times New Roman" w:hAnsi="Times New Roman" w:eastAsia="Times New Roman"/>
+                <w:b w:val="0"/>
+                <w:sz w:val="13"/>
+              </w:rPr>
+              <w:t>0.9941</w:t>
+            </w:r>
+          </w:p>
+        </w:tc>
+        <w:tc>
+          <w:tcPr>
+            <w:tcW w:type="dxa" w:w="752"/>
+          </w:tcPr>
+          <w:p>
+            <w:pPr>
+              <w:spacing w:before="20" w:after="20"/>
+              <w:jc w:val="center"/>
+            </w:pPr>
+            <w:r/>
+            <w:r>
+              <w:rPr>
+                <w:rFonts w:ascii="Times New Roman" w:hAnsi="Times New Roman" w:eastAsia="Times New Roman"/>
+                <w:b w:val="0"/>
+                <w:sz w:val="13"/>
+              </w:rPr>
+              <w:t>0.9940</w:t>
+            </w:r>
+          </w:p>
+        </w:tc>
+        <w:tc>
+          <w:tcPr>
+            <w:tcW w:type="dxa" w:w="752"/>
+          </w:tcPr>
+          <w:p>
+            <w:pPr>
+              <w:spacing w:before="20" w:after="20"/>
+              <w:jc w:val="center"/>
+            </w:pPr>
+            <w:r/>
+            <w:r>
+              <w:rPr>
+                <w:rFonts w:ascii="Times New Roman" w:hAnsi="Times New Roman" w:eastAsia="Times New Roman"/>
+                <w:b w:val="0"/>
+                <w:sz w:val="13"/>
+              </w:rPr>
+              <w:t>0.9940</w:t>
+            </w:r>
+          </w:p>
+        </w:tc>
+      </w:tr>
+      <w:tr>
+        <w:trPr>
+          <w:cantSplit w:val="true"/>
+        </w:trPr>
+        <w:tc>
+          <w:tcPr>
+            <w:tcW w:type="dxa" w:w="752"/>
+            <w:vMerge/>
+          </w:tcPr>
+          <w:p/>
+        </w:tc>
+        <w:tc>
+          <w:tcPr>
+            <w:tcW w:type="dxa" w:w="752"/>
+          </w:tcPr>
+          <w:p>
+            <w:pPr>
+              <w:spacing w:before="20" w:after="20"/>
+              <w:jc w:val="center"/>
+            </w:pPr>
+            <w:r/>
+            <w:r>
+              <w:rPr>
+                <w:rFonts w:ascii="Times New Roman" w:hAnsi="Times New Roman" w:eastAsia="Times New Roman"/>
+                <w:b w:val="0"/>
+                <w:sz w:val="13"/>
+              </w:rPr>
+              <w:t>0.00002</w:t>
+            </w:r>
+          </w:p>
+        </w:tc>
+        <w:tc>
+          <w:tcPr>
+            <w:tcW w:type="dxa" w:w="752"/>
+          </w:tcPr>
+          <w:p>
+            <w:pPr>
+              <w:spacing w:before="20" w:after="20"/>
+              <w:jc w:val="center"/>
+            </w:pPr>
+            <w:r/>
+            <w:r>
+              <w:rPr>
+                <w:rFonts w:ascii="Times New Roman" w:hAnsi="Times New Roman" w:eastAsia="Times New Roman"/>
+                <w:b w:val="0"/>
+                <w:sz w:val="13"/>
+              </w:rPr>
+              <w:t>32</w:t>
+            </w:r>
+          </w:p>
+        </w:tc>
+        <w:tc>
+          <w:tcPr>
+            <w:tcW w:type="dxa" w:w="752"/>
+          </w:tcPr>
+          <w:p>
+            <w:pPr>
+              <w:spacing w:before="20" w:after="20"/>
+              <w:jc w:val="center"/>
+            </w:pPr>
+            <w:r/>
+            <w:r>
+              <w:rPr>
+                <w:rFonts w:ascii="Times New Roman" w:hAnsi="Times New Roman" w:eastAsia="Times New Roman"/>
+                <w:b w:val="0"/>
+                <w:sz w:val="13"/>
+              </w:rPr>
+              <w:t>0.01</w:t>
+            </w:r>
+          </w:p>
+        </w:tc>
+        <w:tc>
+          <w:tcPr>
+            <w:tcW w:type="dxa" w:w="752"/>
+          </w:tcPr>
+          <w:p>
+            <w:pPr>
+              <w:spacing w:before="20" w:after="20"/>
+              <w:jc w:val="center"/>
+            </w:pPr>
+            <w:r/>
+            <w:r>
+              <w:rPr>
+                <w:rFonts w:ascii="Times New Roman" w:hAnsi="Times New Roman" w:eastAsia="Times New Roman"/>
+                <w:b w:val="0"/>
+                <w:sz w:val="13"/>
+              </w:rPr>
+              <w:t>0.9936</w:t>
+            </w:r>
+          </w:p>
+        </w:tc>
+        <w:tc>
+          <w:tcPr>
+            <w:tcW w:type="dxa" w:w="752"/>
+          </w:tcPr>
+          <w:p>
+            <w:pPr>
+              <w:spacing w:before="20" w:after="20"/>
+              <w:jc w:val="center"/>
+            </w:pPr>
+            <w:r/>
+            <w:r>
+              <w:rPr>
+                <w:rFonts w:ascii="Times New Roman" w:hAnsi="Times New Roman" w:eastAsia="Times New Roman"/>
+                <w:b w:val="0"/>
+                <w:sz w:val="13"/>
+              </w:rPr>
+              <w:t>0.9936</w:t>
+            </w:r>
+          </w:p>
+        </w:tc>
+        <w:tc>
+          <w:tcPr>
+            <w:tcW w:type="dxa" w:w="752"/>
+          </w:tcPr>
+          <w:p>
+            <w:pPr>
+              <w:spacing w:before="20" w:after="20"/>
+              <w:jc w:val="center"/>
+            </w:pPr>
+            <w:r/>
+            <w:r>
+              <w:rPr>
+                <w:rFonts w:ascii="Times New Roman" w:hAnsi="Times New Roman" w:eastAsia="Times New Roman"/>
+                <w:b w:val="0"/>
+                <w:sz w:val="13"/>
+              </w:rPr>
+              <w:t>0.9936</w:t>
+            </w:r>
+          </w:p>
+        </w:tc>
+        <w:tc>
+          <w:tcPr>
+            <w:tcW w:type="dxa" w:w="752"/>
+          </w:tcPr>
+          <w:p>
+            <w:pPr>
+              <w:spacing w:before="20" w:after="20"/>
+              <w:jc w:val="center"/>
+            </w:pPr>
+            <w:r/>
+            <w:r>
+              <w:rPr>
+                <w:rFonts w:ascii="Times New Roman" w:hAnsi="Times New Roman" w:eastAsia="Times New Roman"/>
+                <w:b w:val="0"/>
+                <w:sz w:val="13"/>
+              </w:rPr>
+              <w:t>0.9936</w:t>
+            </w:r>
+          </w:p>
+        </w:tc>
+        <w:tc>
+          <w:tcPr>
+            <w:tcW w:type="dxa" w:w="752"/>
+          </w:tcPr>
+          <w:p>
+            <w:pPr>
+              <w:spacing w:before="20" w:after="20"/>
+              <w:jc w:val="center"/>
+            </w:pPr>
+            <w:r/>
+            <w:r>
+              <w:rPr>
+                <w:rFonts w:ascii="Times New Roman" w:hAnsi="Times New Roman" w:eastAsia="Times New Roman"/>
+                <w:b w:val="0"/>
+                <w:sz w:val="13"/>
+              </w:rPr>
+              <w:t>0.9944</w:t>
+            </w:r>
+          </w:p>
+        </w:tc>
+        <w:tc>
+          <w:tcPr>
+            <w:tcW w:type="dxa" w:w="752"/>
+          </w:tcPr>
+          <w:p>
+            <w:pPr>
+              <w:spacing w:before="20" w:after="20"/>
+              <w:jc w:val="center"/>
+            </w:pPr>
+            <w:r/>
+            <w:r>
+              <w:rPr>
+                <w:rFonts w:ascii="Times New Roman" w:hAnsi="Times New Roman" w:eastAsia="Times New Roman"/>
+                <w:b w:val="0"/>
+                <w:sz w:val="13"/>
+              </w:rPr>
+              <w:t>0.9944</w:t>
+            </w:r>
+          </w:p>
+        </w:tc>
+        <w:tc>
+          <w:tcPr>
+            <w:tcW w:type="dxa" w:w="752"/>
+          </w:tcPr>
+          <w:p>
+            <w:pPr>
+              <w:spacing w:before="20" w:after="20"/>
+              <w:jc w:val="center"/>
+            </w:pPr>
+            <w:r/>
+            <w:r>
+              <w:rPr>
+                <w:rFonts w:ascii="Times New Roman" w:hAnsi="Times New Roman" w:eastAsia="Times New Roman"/>
+                <w:b w:val="0"/>
+                <w:sz w:val="13"/>
+              </w:rPr>
+              <w:t>0.9944</w:t>
+            </w:r>
+          </w:p>
+        </w:tc>
+        <w:tc>
+          <w:tcPr>
+            <w:tcW w:type="dxa" w:w="752"/>
+          </w:tcPr>
+          <w:p>
+            <w:pPr>
+              <w:spacing w:before="20" w:after="20"/>
+              <w:jc w:val="center"/>
+            </w:pPr>
+            <w:r/>
+            <w:r>
+              <w:rPr>
+                <w:rFonts w:ascii="Times New Roman" w:hAnsi="Times New Roman" w:eastAsia="Times New Roman"/>
+                <w:b w:val="0"/>
+                <w:sz w:val="13"/>
+              </w:rPr>
+              <w:t>0.9944</w:t>
+            </w:r>
+          </w:p>
+        </w:tc>
+      </w:tr>
+      <w:tr>
+        <w:trPr>
+          <w:cantSplit w:val="true"/>
+        </w:trPr>
+        <w:tc>
+          <w:tcPr>
+            <w:tcW w:type="dxa" w:w="752"/>
+            <w:vMerge/>
+          </w:tcPr>
+          <w:p/>
+        </w:tc>
+        <w:tc>
+          <w:tcPr>
+            <w:tcW w:type="dxa" w:w="752"/>
+          </w:tcPr>
+          <w:p>
+            <w:pPr>
+              <w:spacing w:before="20" w:after="20"/>
+              <w:jc w:val="center"/>
+            </w:pPr>
+            <w:r/>
+            <w:r>
+              <w:rPr>
+                <w:rFonts w:ascii="Times New Roman" w:hAnsi="Times New Roman" w:eastAsia="Times New Roman"/>
+                <w:b w:val="0"/>
+                <w:sz w:val="13"/>
+              </w:rPr>
+              <w:t>0.00003</w:t>
+            </w:r>
+          </w:p>
+        </w:tc>
+        <w:tc>
+          <w:tcPr>
+            <w:tcW w:type="dxa" w:w="752"/>
+          </w:tcPr>
+          <w:p>
+            <w:pPr>
+              <w:spacing w:before="20" w:after="20"/>
+              <w:jc w:val="center"/>
+            </w:pPr>
+            <w:r/>
+            <w:r>
+              <w:rPr>
+                <w:rFonts w:ascii="Times New Roman" w:hAnsi="Times New Roman" w:eastAsia="Times New Roman"/>
+                <w:b w:val="0"/>
+                <w:sz w:val="13"/>
+              </w:rPr>
+              <w:t>32</w:t>
+            </w:r>
+          </w:p>
+        </w:tc>
+        <w:tc>
+          <w:tcPr>
+            <w:tcW w:type="dxa" w:w="752"/>
+          </w:tcPr>
+          <w:p>
+            <w:pPr>
+              <w:spacing w:before="20" w:after="20"/>
+              <w:jc w:val="center"/>
+            </w:pPr>
+            <w:r/>
+            <w:r>
+              <w:rPr>
+                <w:rFonts w:ascii="Times New Roman" w:hAnsi="Times New Roman" w:eastAsia="Times New Roman"/>
+                <w:b w:val="0"/>
+                <w:sz w:val="13"/>
+              </w:rPr>
+              <w:t>0.01</w:t>
+            </w:r>
+          </w:p>
+        </w:tc>
+        <w:tc>
+          <w:tcPr>
+            <w:tcW w:type="dxa" w:w="752"/>
+          </w:tcPr>
+          <w:p>
+            <w:pPr>
+              <w:spacing w:before="20" w:after="20"/>
+              <w:jc w:val="center"/>
+            </w:pPr>
+            <w:r/>
+            <w:r>
+              <w:rPr>
+                <w:rFonts w:ascii="Times New Roman" w:hAnsi="Times New Roman" w:eastAsia="Times New Roman"/>
+                <w:b w:val="0"/>
+                <w:sz w:val="13"/>
+              </w:rPr>
+              <w:t>0.9919</w:t>
+            </w:r>
+          </w:p>
+        </w:tc>
+        <w:tc>
+          <w:tcPr>
+            <w:tcW w:type="dxa" w:w="752"/>
+          </w:tcPr>
+          <w:p>
+            <w:pPr>
+              <w:spacing w:before="20" w:after="20"/>
+              <w:jc w:val="center"/>
+            </w:pPr>
+            <w:r/>
+            <w:r>
+              <w:rPr>
+                <w:rFonts w:ascii="Times New Roman" w:hAnsi="Times New Roman" w:eastAsia="Times New Roman"/>
+                <w:b w:val="0"/>
+                <w:sz w:val="13"/>
+              </w:rPr>
+              <w:t>0.9919</w:t>
+            </w:r>
+          </w:p>
+        </w:tc>
+        <w:tc>
+          <w:tcPr>
+            <w:tcW w:type="dxa" w:w="752"/>
+          </w:tcPr>
+          <w:p>
+            <w:pPr>
+              <w:spacing w:before="20" w:after="20"/>
+              <w:jc w:val="center"/>
+            </w:pPr>
+            <w:r/>
+            <w:r>
+              <w:rPr>
+                <w:rFonts w:ascii="Times New Roman" w:hAnsi="Times New Roman" w:eastAsia="Times New Roman"/>
+                <w:b w:val="0"/>
+                <w:sz w:val="13"/>
+              </w:rPr>
+              <w:t>0.9919</w:t>
+            </w:r>
+          </w:p>
+        </w:tc>
+        <w:tc>
+          <w:tcPr>
+            <w:tcW w:type="dxa" w:w="752"/>
+          </w:tcPr>
+          <w:p>
+            <w:pPr>
+              <w:spacing w:before="20" w:after="20"/>
+              <w:jc w:val="center"/>
+            </w:pPr>
+            <w:r/>
+            <w:r>
+              <w:rPr>
+                <w:rFonts w:ascii="Times New Roman" w:hAnsi="Times New Roman" w:eastAsia="Times New Roman"/>
+                <w:b w:val="0"/>
+                <w:sz w:val="13"/>
+              </w:rPr>
+              <w:t>0.9919</w:t>
+            </w:r>
+          </w:p>
+        </w:tc>
+        <w:tc>
+          <w:tcPr>
+            <w:tcW w:type="dxa" w:w="752"/>
+          </w:tcPr>
+          <w:p>
+            <w:pPr>
+              <w:spacing w:before="20" w:after="20"/>
+              <w:jc w:val="center"/>
+            </w:pPr>
+            <w:r/>
+            <w:r>
+              <w:rPr>
+                <w:rFonts w:ascii="Times New Roman" w:hAnsi="Times New Roman" w:eastAsia="Times New Roman"/>
+                <w:b w:val="0"/>
+                <w:sz w:val="13"/>
+              </w:rPr>
+              <w:t>0.9929</w:t>
+            </w:r>
+          </w:p>
+        </w:tc>
+        <w:tc>
+          <w:tcPr>
+            <w:tcW w:type="dxa" w:w="752"/>
+          </w:tcPr>
+          <w:p>
+            <w:pPr>
+              <w:spacing w:before="20" w:after="20"/>
+              <w:jc w:val="center"/>
+            </w:pPr>
+            <w:r/>
+            <w:r>
+              <w:rPr>
+                <w:rFonts w:ascii="Times New Roman" w:hAnsi="Times New Roman" w:eastAsia="Times New Roman"/>
+                <w:b w:val="0"/>
+                <w:sz w:val="13"/>
+              </w:rPr>
+              <w:t>0.9930</w:t>
+            </w:r>
+          </w:p>
+        </w:tc>
+        <w:tc>
+          <w:tcPr>
+            <w:tcW w:type="dxa" w:w="752"/>
+          </w:tcPr>
+          <w:p>
+            <w:pPr>
+              <w:spacing w:before="20" w:after="20"/>
+              <w:jc w:val="center"/>
+            </w:pPr>
+            <w:r/>
+            <w:r>
+              <w:rPr>
+                <w:rFonts w:ascii="Times New Roman" w:hAnsi="Times New Roman" w:eastAsia="Times New Roman"/>
+                <w:b w:val="0"/>
+                <w:sz w:val="13"/>
+              </w:rPr>
+              <w:t>0.9929</w:t>
+            </w:r>
+          </w:p>
+        </w:tc>
+        <w:tc>
+          <w:tcPr>
+            <w:tcW w:type="dxa" w:w="752"/>
+          </w:tcPr>
+          <w:p>
+            <w:pPr>
+              <w:spacing w:before="20" w:after="20"/>
+              <w:jc w:val="center"/>
+            </w:pPr>
+            <w:r/>
+            <w:r>
+              <w:rPr>
+                <w:rFonts w:ascii="Times New Roman" w:hAnsi="Times New Roman" w:eastAsia="Times New Roman"/>
+                <w:b w:val="0"/>
+                <w:sz w:val="13"/>
+              </w:rPr>
+              <w:t>0.9929</w:t>
+            </w:r>
+          </w:p>
+        </w:tc>
+      </w:tr>
+      <w:tr>
+        <w:trPr>
+          <w:cantSplit w:val="true"/>
+        </w:trPr>
+        <w:tc>
+          <w:tcPr>
+            <w:tcW w:type="dxa" w:w="752"/>
+            <w:vMerge/>
+          </w:tcPr>
+          <w:p/>
+        </w:tc>
+        <w:tc>
+          <w:tcPr>
+            <w:tcW w:type="dxa" w:w="752"/>
+          </w:tcPr>
+          <w:p>
+            <w:pPr>
+              <w:spacing w:before="20" w:after="20"/>
+              <w:jc w:val="center"/>
+            </w:pPr>
+            <w:r/>
+            <w:r>
+              <w:rPr>
+                <w:rFonts w:ascii="Times New Roman" w:hAnsi="Times New Roman" w:eastAsia="Times New Roman"/>
+                <w:b w:val="0"/>
+                <w:sz w:val="13"/>
+              </w:rPr>
+              <w:t>0.00002</w:t>
+            </w:r>
+          </w:p>
+        </w:tc>
+        <w:tc>
+          <w:tcPr>
+            <w:tcW w:type="dxa" w:w="752"/>
+          </w:tcPr>
+          <w:p>
+            <w:pPr>
+              <w:spacing w:before="20" w:after="20"/>
+              <w:jc w:val="center"/>
+            </w:pPr>
+            <w:r/>
+            <w:r>
+              <w:rPr>
+                <w:rFonts w:ascii="Times New Roman" w:hAnsi="Times New Roman" w:eastAsia="Times New Roman"/>
+                <w:b w:val="0"/>
+                <w:sz w:val="13"/>
+              </w:rPr>
+              <w:t>16</w:t>
+            </w:r>
+          </w:p>
+        </w:tc>
+        <w:tc>
+          <w:tcPr>
+            <w:tcW w:type="dxa" w:w="752"/>
+          </w:tcPr>
+          <w:p>
+            <w:pPr>
+              <w:spacing w:before="20" w:after="20"/>
+              <w:jc w:val="center"/>
+            </w:pPr>
+            <w:r/>
+            <w:r>
+              <w:rPr>
+                <w:rFonts w:ascii="Times New Roman" w:hAnsi="Times New Roman" w:eastAsia="Times New Roman"/>
+                <w:b w:val="0"/>
+                <w:sz w:val="13"/>
+              </w:rPr>
+              <w:t>0.1</w:t>
+            </w:r>
+          </w:p>
+        </w:tc>
+        <w:tc>
+          <w:tcPr>
+            <w:tcW w:type="dxa" w:w="752"/>
+          </w:tcPr>
+          <w:p>
+            <w:pPr>
+              <w:spacing w:before="20" w:after="20"/>
+              <w:jc w:val="center"/>
+            </w:pPr>
+            <w:r/>
+            <w:r>
+              <w:rPr>
+                <w:rFonts w:ascii="Times New Roman" w:hAnsi="Times New Roman" w:eastAsia="Times New Roman"/>
+                <w:b w:val="0"/>
+                <w:sz w:val="13"/>
+              </w:rPr>
+              <w:t>0.9869</w:t>
+            </w:r>
+          </w:p>
+        </w:tc>
+        <w:tc>
+          <w:tcPr>
+            <w:tcW w:type="dxa" w:w="752"/>
+          </w:tcPr>
+          <w:p>
+            <w:pPr>
+              <w:spacing w:before="20" w:after="20"/>
+              <w:jc w:val="center"/>
+            </w:pPr>
+            <w:r/>
+            <w:r>
+              <w:rPr>
+                <w:rFonts w:ascii="Times New Roman" w:hAnsi="Times New Roman" w:eastAsia="Times New Roman"/>
+                <w:b w:val="0"/>
+                <w:sz w:val="13"/>
+              </w:rPr>
+              <w:t>0.9870</w:t>
+            </w:r>
+          </w:p>
+        </w:tc>
+        <w:tc>
+          <w:tcPr>
+            <w:tcW w:type="dxa" w:w="752"/>
+          </w:tcPr>
+          <w:p>
+            <w:pPr>
+              <w:spacing w:before="20" w:after="20"/>
+              <w:jc w:val="center"/>
+            </w:pPr>
+            <w:r/>
+            <w:r>
+              <w:rPr>
+                <w:rFonts w:ascii="Times New Roman" w:hAnsi="Times New Roman" w:eastAsia="Times New Roman"/>
+                <w:b w:val="0"/>
+                <w:sz w:val="13"/>
+              </w:rPr>
+              <w:t>0.9869</w:t>
+            </w:r>
+          </w:p>
+        </w:tc>
+        <w:tc>
+          <w:tcPr>
+            <w:tcW w:type="dxa" w:w="752"/>
+          </w:tcPr>
+          <w:p>
+            <w:pPr>
+              <w:spacing w:before="20" w:after="20"/>
+              <w:jc w:val="center"/>
+            </w:pPr>
+            <w:r/>
+            <w:r>
+              <w:rPr>
+                <w:rFonts w:ascii="Times New Roman" w:hAnsi="Times New Roman" w:eastAsia="Times New Roman"/>
+                <w:b w:val="0"/>
+                <w:sz w:val="13"/>
+              </w:rPr>
+              <w:t>0.9869</w:t>
+            </w:r>
+          </w:p>
+        </w:tc>
+        <w:tc>
+          <w:tcPr>
+            <w:tcW w:type="dxa" w:w="752"/>
+          </w:tcPr>
+          <w:p>
+            <w:pPr>
+              <w:spacing w:before="20" w:after="20"/>
+              <w:jc w:val="center"/>
+            </w:pPr>
+            <w:r/>
+            <w:r>
+              <w:rPr>
+                <w:rFonts w:ascii="Times New Roman" w:hAnsi="Times New Roman" w:eastAsia="Times New Roman"/>
+                <w:b w:val="0"/>
+                <w:sz w:val="13"/>
+              </w:rPr>
+              <w:t>0.9916</w:t>
+            </w:r>
+          </w:p>
+        </w:tc>
+        <w:tc>
+          <w:tcPr>
+            <w:tcW w:type="dxa" w:w="752"/>
+          </w:tcPr>
+          <w:p>
+            <w:pPr>
+              <w:spacing w:before="20" w:after="20"/>
+              <w:jc w:val="center"/>
+            </w:pPr>
+            <w:r/>
+            <w:r>
+              <w:rPr>
+                <w:rFonts w:ascii="Times New Roman" w:hAnsi="Times New Roman" w:eastAsia="Times New Roman"/>
+                <w:b w:val="0"/>
+                <w:sz w:val="13"/>
+              </w:rPr>
+              <w:t>0.9917</w:t>
+            </w:r>
+          </w:p>
+        </w:tc>
+        <w:tc>
+          <w:tcPr>
+            <w:tcW w:type="dxa" w:w="752"/>
+          </w:tcPr>
+          <w:p>
+            <w:pPr>
+              <w:spacing w:before="20" w:after="20"/>
+              <w:jc w:val="center"/>
+            </w:pPr>
+            <w:r/>
+            <w:r>
+              <w:rPr>
+                <w:rFonts w:ascii="Times New Roman" w:hAnsi="Times New Roman" w:eastAsia="Times New Roman"/>
+                <w:b w:val="0"/>
+                <w:sz w:val="13"/>
+              </w:rPr>
+              <w:t>0.9916</w:t>
+            </w:r>
+          </w:p>
+        </w:tc>
+        <w:tc>
+          <w:tcPr>
+            <w:tcW w:type="dxa" w:w="752"/>
+          </w:tcPr>
+          <w:p>
+            <w:pPr>
+              <w:spacing w:before="20" w:after="20"/>
+              <w:jc w:val="center"/>
+            </w:pPr>
+            <w:r/>
+            <w:r>
+              <w:rPr>
+                <w:rFonts w:ascii="Times New Roman" w:hAnsi="Times New Roman" w:eastAsia="Times New Roman"/>
+                <w:b w:val="0"/>
+                <w:sz w:val="13"/>
+              </w:rPr>
+              <w:t>0.9916</w:t>
+            </w:r>
+          </w:p>
+        </w:tc>
+      </w:tr>
+      <w:tr>
+        <w:trPr>
+          <w:cantSplit w:val="true"/>
+        </w:trPr>
+        <w:tc>
+          <w:tcPr>
+            <w:tcW w:type="dxa" w:w="752"/>
+            <w:vMerge/>
+          </w:tcPr>
+          <w:p/>
+        </w:tc>
+        <w:tc>
+          <w:tcPr>
+            <w:tcW w:type="dxa" w:w="752"/>
+          </w:tcPr>
+          <w:p>
+            <w:pPr>
+              <w:spacing w:before="20" w:after="20"/>
+              <w:jc w:val="center"/>
+            </w:pPr>
+            <w:r/>
+            <w:r>
+              <w:rPr>
+                <w:rFonts w:ascii="Times New Roman" w:hAnsi="Times New Roman" w:eastAsia="Times New Roman"/>
+                <w:b w:val="0"/>
+                <w:sz w:val="13"/>
+              </w:rPr>
+              <w:t>0.00003</w:t>
+            </w:r>
+          </w:p>
+        </w:tc>
+        <w:tc>
+          <w:tcPr>
+            <w:tcW w:type="dxa" w:w="752"/>
+          </w:tcPr>
+          <w:p>
+            <w:pPr>
+              <w:spacing w:before="20" w:after="20"/>
+              <w:jc w:val="center"/>
+            </w:pPr>
+            <w:r/>
+            <w:r>
+              <w:rPr>
+                <w:rFonts w:ascii="Times New Roman" w:hAnsi="Times New Roman" w:eastAsia="Times New Roman"/>
+                <w:b w:val="0"/>
+                <w:sz w:val="13"/>
+              </w:rPr>
+              <w:t>16</w:t>
+            </w:r>
+          </w:p>
+        </w:tc>
+        <w:tc>
+          <w:tcPr>
+            <w:tcW w:type="dxa" w:w="752"/>
+          </w:tcPr>
+          <w:p>
+            <w:pPr>
+              <w:spacing w:before="20" w:after="20"/>
+              <w:jc w:val="center"/>
+            </w:pPr>
+            <w:r/>
+            <w:r>
+              <w:rPr>
+                <w:rFonts w:ascii="Times New Roman" w:hAnsi="Times New Roman" w:eastAsia="Times New Roman"/>
+                <w:b w:val="0"/>
+                <w:sz w:val="13"/>
+              </w:rPr>
+              <w:t>0.1</w:t>
+            </w:r>
+          </w:p>
+        </w:tc>
+        <w:tc>
+          <w:tcPr>
+            <w:tcW w:type="dxa" w:w="752"/>
+          </w:tcPr>
+          <w:p>
+            <w:pPr>
+              <w:spacing w:before="20" w:after="20"/>
+              <w:jc w:val="center"/>
+            </w:pPr>
+            <w:r/>
+            <w:r>
+              <w:rPr>
+                <w:rFonts w:ascii="Times New Roman" w:hAnsi="Times New Roman" w:eastAsia="Times New Roman"/>
+                <w:b w:val="0"/>
+                <w:sz w:val="13"/>
+              </w:rPr>
+              <w:t>0.9901</w:t>
+            </w:r>
+          </w:p>
+        </w:tc>
+        <w:tc>
+          <w:tcPr>
+            <w:tcW w:type="dxa" w:w="752"/>
+          </w:tcPr>
+          <w:p>
+            <w:pPr>
+              <w:spacing w:before="20" w:after="20"/>
+              <w:jc w:val="center"/>
+            </w:pPr>
+            <w:r/>
+            <w:r>
+              <w:rPr>
+                <w:rFonts w:ascii="Times New Roman" w:hAnsi="Times New Roman" w:eastAsia="Times New Roman"/>
+                <w:b w:val="0"/>
+                <w:sz w:val="13"/>
+              </w:rPr>
+              <w:t>0.9902</w:t>
+            </w:r>
+          </w:p>
+        </w:tc>
+        <w:tc>
+          <w:tcPr>
+            <w:tcW w:type="dxa" w:w="752"/>
+          </w:tcPr>
+          <w:p>
+            <w:pPr>
+              <w:spacing w:before="20" w:after="20"/>
+              <w:jc w:val="center"/>
+            </w:pPr>
+            <w:r/>
+            <w:r>
+              <w:rPr>
+                <w:rFonts w:ascii="Times New Roman" w:hAnsi="Times New Roman" w:eastAsia="Times New Roman"/>
+                <w:b w:val="0"/>
+                <w:sz w:val="13"/>
+              </w:rPr>
+              <w:t>0.9901</w:t>
+            </w:r>
+          </w:p>
+        </w:tc>
+        <w:tc>
+          <w:tcPr>
+            <w:tcW w:type="dxa" w:w="752"/>
+          </w:tcPr>
+          <w:p>
+            <w:pPr>
+              <w:spacing w:before="20" w:after="20"/>
+              <w:jc w:val="center"/>
+            </w:pPr>
+            <w:r/>
+            <w:r>
+              <w:rPr>
+                <w:rFonts w:ascii="Times New Roman" w:hAnsi="Times New Roman" w:eastAsia="Times New Roman"/>
+                <w:b w:val="0"/>
+                <w:sz w:val="13"/>
+              </w:rPr>
+              <w:t>0.9901</w:t>
+            </w:r>
+          </w:p>
+        </w:tc>
+        <w:tc>
+          <w:tcPr>
+            <w:tcW w:type="dxa" w:w="752"/>
+          </w:tcPr>
+          <w:p>
+            <w:pPr>
+              <w:spacing w:before="20" w:after="20"/>
+              <w:jc w:val="center"/>
+            </w:pPr>
+            <w:r/>
+            <w:r>
+              <w:rPr>
+                <w:rFonts w:ascii="Times New Roman" w:hAnsi="Times New Roman" w:eastAsia="Times New Roman"/>
+                <w:b w:val="0"/>
+                <w:sz w:val="13"/>
+              </w:rPr>
+              <w:t>0.9911</w:t>
+            </w:r>
+          </w:p>
+        </w:tc>
+        <w:tc>
+          <w:tcPr>
+            <w:tcW w:type="dxa" w:w="752"/>
+          </w:tcPr>
+          <w:p>
+            <w:pPr>
+              <w:spacing w:before="20" w:after="20"/>
+              <w:jc w:val="center"/>
+            </w:pPr>
+            <w:r/>
+            <w:r>
+              <w:rPr>
+                <w:rFonts w:ascii="Times New Roman" w:hAnsi="Times New Roman" w:eastAsia="Times New Roman"/>
+                <w:b w:val="0"/>
+                <w:sz w:val="13"/>
+              </w:rPr>
+              <w:t>0.9912</w:t>
+            </w:r>
+          </w:p>
+        </w:tc>
+        <w:tc>
+          <w:tcPr>
+            <w:tcW w:type="dxa" w:w="752"/>
+          </w:tcPr>
+          <w:p>
+            <w:pPr>
+              <w:spacing w:before="20" w:after="20"/>
+              <w:jc w:val="center"/>
+            </w:pPr>
+            <w:r/>
+            <w:r>
+              <w:rPr>
+                <w:rFonts w:ascii="Times New Roman" w:hAnsi="Times New Roman" w:eastAsia="Times New Roman"/>
+                <w:b w:val="0"/>
+                <w:sz w:val="13"/>
+              </w:rPr>
+              <w:t>0.9911</w:t>
+            </w:r>
+          </w:p>
+        </w:tc>
+        <w:tc>
+          <w:tcPr>
+            <w:tcW w:type="dxa" w:w="752"/>
+          </w:tcPr>
+          <w:p>
+            <w:pPr>
+              <w:spacing w:before="20" w:after="20"/>
+              <w:jc w:val="center"/>
+            </w:pPr>
+            <w:r/>
+            <w:r>
+              <w:rPr>
+                <w:rFonts w:ascii="Times New Roman" w:hAnsi="Times New Roman" w:eastAsia="Times New Roman"/>
+                <w:b w:val="0"/>
+                <w:sz w:val="13"/>
+              </w:rPr>
+              <w:t>0.9911</w:t>
+            </w:r>
+          </w:p>
+        </w:tc>
+      </w:tr>
+      <w:tr>
+        <w:trPr>
+          <w:cantSplit w:val="true"/>
+        </w:trPr>
+        <w:tc>
+          <w:tcPr>
+            <w:tcW w:type="dxa" w:w="752"/>
+            <w:vMerge/>
+          </w:tcPr>
+          <w:p/>
+        </w:tc>
+        <w:tc>
+          <w:tcPr>
+            <w:tcW w:type="dxa" w:w="752"/>
+          </w:tcPr>
+          <w:p>
+            <w:pPr>
+              <w:spacing w:before="20" w:after="20"/>
+              <w:jc w:val="center"/>
+            </w:pPr>
+            <w:r/>
+            <w:r>
+              <w:rPr>
+                <w:rFonts w:ascii="Times New Roman" w:hAnsi="Times New Roman" w:eastAsia="Times New Roman"/>
+                <w:b w:val="0"/>
+                <w:sz w:val="13"/>
+              </w:rPr>
+              <w:t>0.00002</w:t>
+            </w:r>
+          </w:p>
+        </w:tc>
+        <w:tc>
+          <w:tcPr>
+            <w:tcW w:type="dxa" w:w="752"/>
+          </w:tcPr>
+          <w:p>
+            <w:pPr>
+              <w:spacing w:before="20" w:after="20"/>
+              <w:jc w:val="center"/>
+            </w:pPr>
+            <w:r/>
+            <w:r>
+              <w:rPr>
+                <w:rFonts w:ascii="Times New Roman" w:hAnsi="Times New Roman" w:eastAsia="Times New Roman"/>
+                <w:b w:val="0"/>
+                <w:sz w:val="13"/>
+              </w:rPr>
+              <w:t>32</w:t>
+            </w:r>
+          </w:p>
+        </w:tc>
+        <w:tc>
+          <w:tcPr>
+            <w:tcW w:type="dxa" w:w="752"/>
+          </w:tcPr>
+          <w:p>
+            <w:pPr>
+              <w:spacing w:before="20" w:after="20"/>
+              <w:jc w:val="center"/>
+            </w:pPr>
+            <w:r/>
+            <w:r>
+              <w:rPr>
+                <w:rFonts w:ascii="Times New Roman" w:hAnsi="Times New Roman" w:eastAsia="Times New Roman"/>
+                <w:b w:val="0"/>
+                <w:sz w:val="13"/>
+              </w:rPr>
+              <w:t>0.1</w:t>
+            </w:r>
+          </w:p>
+        </w:tc>
+        <w:tc>
+          <w:tcPr>
+            <w:tcW w:type="dxa" w:w="752"/>
+          </w:tcPr>
+          <w:p>
+            <w:pPr>
+              <w:spacing w:before="20" w:after="20"/>
+              <w:jc w:val="center"/>
+            </w:pPr>
+            <w:r/>
+            <w:r>
+              <w:rPr>
+                <w:rFonts w:ascii="Times New Roman" w:hAnsi="Times New Roman" w:eastAsia="Times New Roman"/>
+                <w:b w:val="0"/>
+                <w:sz w:val="13"/>
+              </w:rPr>
+              <w:t>0.9924</w:t>
+            </w:r>
+          </w:p>
+        </w:tc>
+        <w:tc>
+          <w:tcPr>
+            <w:tcW w:type="dxa" w:w="752"/>
+          </w:tcPr>
+          <w:p>
+            <w:pPr>
+              <w:spacing w:before="20" w:after="20"/>
+              <w:jc w:val="center"/>
+            </w:pPr>
+            <w:r/>
+            <w:r>
+              <w:rPr>
+                <w:rFonts w:ascii="Times New Roman" w:hAnsi="Times New Roman" w:eastAsia="Times New Roman"/>
+                <w:b w:val="0"/>
+                <w:sz w:val="13"/>
+              </w:rPr>
+              <w:t>0.9924</w:t>
+            </w:r>
+          </w:p>
+        </w:tc>
+        <w:tc>
+          <w:tcPr>
+            <w:tcW w:type="dxa" w:w="752"/>
+          </w:tcPr>
+          <w:p>
+            <w:pPr>
+              <w:spacing w:before="20" w:after="20"/>
+              <w:jc w:val="center"/>
+            </w:pPr>
+            <w:r/>
+            <w:r>
+              <w:rPr>
+                <w:rFonts w:ascii="Times New Roman" w:hAnsi="Times New Roman" w:eastAsia="Times New Roman"/>
+                <w:b w:val="0"/>
+                <w:sz w:val="13"/>
+              </w:rPr>
+              <w:t>0.9924</w:t>
+            </w:r>
+          </w:p>
+        </w:tc>
+        <w:tc>
+          <w:tcPr>
+            <w:tcW w:type="dxa" w:w="752"/>
+          </w:tcPr>
+          <w:p>
+            <w:pPr>
+              <w:spacing w:before="20" w:after="20"/>
+              <w:jc w:val="center"/>
+            </w:pPr>
+            <w:r/>
+            <w:r>
+              <w:rPr>
+                <w:rFonts w:ascii="Times New Roman" w:hAnsi="Times New Roman" w:eastAsia="Times New Roman"/>
+                <w:b w:val="0"/>
+                <w:sz w:val="13"/>
+              </w:rPr>
+              <w:t>0.9924</w:t>
+            </w:r>
+          </w:p>
+        </w:tc>
+        <w:tc>
+          <w:tcPr>
+            <w:tcW w:type="dxa" w:w="752"/>
+          </w:tcPr>
+          <w:p>
+            <w:pPr>
+              <w:spacing w:before="20" w:after="20"/>
+              <w:jc w:val="center"/>
+            </w:pPr>
+            <w:r/>
+            <w:r>
+              <w:rPr>
+                <w:rFonts w:ascii="Times New Roman" w:hAnsi="Times New Roman" w:eastAsia="Times New Roman"/>
+                <w:b w:val="0"/>
+                <w:sz w:val="13"/>
+              </w:rPr>
+              <w:t>0.9945</w:t>
+            </w:r>
+          </w:p>
+        </w:tc>
+        <w:tc>
+          <w:tcPr>
+            <w:tcW w:type="dxa" w:w="752"/>
+          </w:tcPr>
+          <w:p>
+            <w:pPr>
+              <w:spacing w:before="20" w:after="20"/>
+              <w:jc w:val="center"/>
+            </w:pPr>
+            <w:r/>
+            <w:r>
+              <w:rPr>
+                <w:rFonts w:ascii="Times New Roman" w:hAnsi="Times New Roman" w:eastAsia="Times New Roman"/>
+                <w:b w:val="0"/>
+                <w:sz w:val="13"/>
+              </w:rPr>
+              <w:t>0.9945</w:t>
+            </w:r>
+          </w:p>
+        </w:tc>
+        <w:tc>
+          <w:tcPr>
+            <w:tcW w:type="dxa" w:w="752"/>
+          </w:tcPr>
+          <w:p>
+            <w:pPr>
+              <w:spacing w:before="20" w:after="20"/>
+              <w:jc w:val="center"/>
+            </w:pPr>
+            <w:r/>
+            <w:r>
+              <w:rPr>
+                <w:rFonts w:ascii="Times New Roman" w:hAnsi="Times New Roman" w:eastAsia="Times New Roman"/>
+                <w:b w:val="0"/>
+                <w:sz w:val="13"/>
+              </w:rPr>
+              <w:t>0.9945</w:t>
+            </w:r>
+          </w:p>
+        </w:tc>
+        <w:tc>
+          <w:tcPr>
+            <w:tcW w:type="dxa" w:w="752"/>
+          </w:tcPr>
+          <w:p>
+            <w:pPr>
+              <w:spacing w:before="20" w:after="20"/>
+              <w:jc w:val="center"/>
+            </w:pPr>
+            <w:r/>
+            <w:r>
+              <w:rPr>
+                <w:rFonts w:ascii="Times New Roman" w:hAnsi="Times New Roman" w:eastAsia="Times New Roman"/>
+                <w:b w:val="0"/>
+                <w:sz w:val="13"/>
+              </w:rPr>
+              <w:t>0.9945</w:t>
+            </w:r>
+          </w:p>
+        </w:tc>
+      </w:tr>
+      <w:tr>
+        <w:trPr>
+          <w:cantSplit w:val="true"/>
+        </w:trPr>
+        <w:tc>
+          <w:tcPr>
+            <w:tcW w:type="dxa" w:w="752"/>
+            <w:vMerge/>
+          </w:tcPr>
+          <w:p/>
+        </w:tc>
+        <w:tc>
+          <w:tcPr>
+            <w:tcW w:type="dxa" w:w="752"/>
+          </w:tcPr>
+          <w:p>
+            <w:pPr>
+              <w:spacing w:before="20" w:after="20"/>
+              <w:jc w:val="center"/>
+            </w:pPr>
+            <w:r/>
+            <w:r>
+              <w:rPr>
+                <w:rFonts w:ascii="Times New Roman" w:hAnsi="Times New Roman" w:eastAsia="Times New Roman"/>
+                <w:b w:val="0"/>
+                <w:sz w:val="13"/>
+              </w:rPr>
+              <w:t>0.00003</w:t>
+            </w:r>
+          </w:p>
+        </w:tc>
+        <w:tc>
+          <w:tcPr>
+            <w:tcW w:type="dxa" w:w="752"/>
+          </w:tcPr>
+          <w:p>
+            <w:pPr>
+              <w:spacing w:before="20" w:after="20"/>
+              <w:jc w:val="center"/>
+            </w:pPr>
+            <w:r/>
+            <w:r>
+              <w:rPr>
+                <w:rFonts w:ascii="Times New Roman" w:hAnsi="Times New Roman" w:eastAsia="Times New Roman"/>
+                <w:b w:val="0"/>
+                <w:sz w:val="13"/>
+              </w:rPr>
+              <w:t>32</w:t>
+            </w:r>
+          </w:p>
+        </w:tc>
+        <w:tc>
+          <w:tcPr>
+            <w:tcW w:type="dxa" w:w="752"/>
+          </w:tcPr>
+          <w:p>
+            <w:pPr>
+              <w:spacing w:before="20" w:after="20"/>
+              <w:jc w:val="center"/>
+            </w:pPr>
+            <w:r/>
+            <w:r>
+              <w:rPr>
+                <w:rFonts w:ascii="Times New Roman" w:hAnsi="Times New Roman" w:eastAsia="Times New Roman"/>
+                <w:b w:val="0"/>
+                <w:sz w:val="13"/>
+              </w:rPr>
+              <w:t>0.1</w:t>
+            </w:r>
+          </w:p>
+        </w:tc>
+        <w:tc>
+          <w:tcPr>
+            <w:tcW w:type="dxa" w:w="752"/>
+          </w:tcPr>
+          <w:p>
+            <w:pPr>
+              <w:spacing w:before="20" w:after="20"/>
+              <w:jc w:val="center"/>
+            </w:pPr>
+            <w:r/>
+            <w:r>
+              <w:rPr>
+                <w:rFonts w:ascii="Times New Roman" w:hAnsi="Times New Roman" w:eastAsia="Times New Roman"/>
+                <w:b w:val="0"/>
+                <w:sz w:val="13"/>
+              </w:rPr>
+              <w:t>0.9916</w:t>
+            </w:r>
+          </w:p>
+        </w:tc>
+        <w:tc>
+          <w:tcPr>
+            <w:tcW w:type="dxa" w:w="752"/>
+          </w:tcPr>
+          <w:p>
+            <w:pPr>
+              <w:spacing w:before="20" w:after="20"/>
+              <w:jc w:val="center"/>
+            </w:pPr>
+            <w:r/>
+            <w:r>
+              <w:rPr>
+                <w:rFonts w:ascii="Times New Roman" w:hAnsi="Times New Roman" w:eastAsia="Times New Roman"/>
+                <w:b w:val="0"/>
+                <w:sz w:val="13"/>
+              </w:rPr>
+              <w:t>0.9916</w:t>
+            </w:r>
+          </w:p>
+        </w:tc>
+        <w:tc>
+          <w:tcPr>
+            <w:tcW w:type="dxa" w:w="752"/>
+          </w:tcPr>
+          <w:p>
+            <w:pPr>
+              <w:spacing w:before="20" w:after="20"/>
+              <w:jc w:val="center"/>
+            </w:pPr>
+            <w:r/>
+            <w:r>
+              <w:rPr>
+                <w:rFonts w:ascii="Times New Roman" w:hAnsi="Times New Roman" w:eastAsia="Times New Roman"/>
+                <w:b w:val="0"/>
+                <w:sz w:val="13"/>
+              </w:rPr>
+              <w:t>0.9916</w:t>
+            </w:r>
+          </w:p>
+        </w:tc>
+        <w:tc>
+          <w:tcPr>
+            <w:tcW w:type="dxa" w:w="752"/>
+          </w:tcPr>
+          <w:p>
+            <w:pPr>
+              <w:spacing w:before="20" w:after="20"/>
+              <w:jc w:val="center"/>
+            </w:pPr>
+            <w:r/>
+            <w:r>
+              <w:rPr>
+                <w:rFonts w:ascii="Times New Roman" w:hAnsi="Times New Roman" w:eastAsia="Times New Roman"/>
+                <w:b w:val="0"/>
+                <w:sz w:val="13"/>
+              </w:rPr>
+              <w:t>0.9916</w:t>
+            </w:r>
+          </w:p>
+        </w:tc>
+        <w:tc>
+          <w:tcPr>
+            <w:tcW w:type="dxa" w:w="752"/>
+          </w:tcPr>
+          <w:p>
+            <w:pPr>
+              <w:spacing w:before="20" w:after="20"/>
+              <w:jc w:val="center"/>
+            </w:pPr>
+            <w:r/>
+            <w:r>
+              <w:rPr>
+                <w:rFonts w:ascii="Times New Roman" w:hAnsi="Times New Roman" w:eastAsia="Times New Roman"/>
+                <w:b w:val="0"/>
+                <w:sz w:val="13"/>
+              </w:rPr>
+              <w:t>0.9933</w:t>
+            </w:r>
+          </w:p>
+        </w:tc>
+        <w:tc>
+          <w:tcPr>
+            <w:tcW w:type="dxa" w:w="752"/>
+          </w:tcPr>
+          <w:p>
+            <w:pPr>
+              <w:spacing w:before="20" w:after="20"/>
+              <w:jc w:val="center"/>
+            </w:pPr>
+            <w:r/>
+            <w:r>
+              <w:rPr>
+                <w:rFonts w:ascii="Times New Roman" w:hAnsi="Times New Roman" w:eastAsia="Times New Roman"/>
+                <w:b w:val="0"/>
+                <w:sz w:val="13"/>
+              </w:rPr>
+              <w:t>0.9933</w:t>
+            </w:r>
+          </w:p>
+        </w:tc>
+        <w:tc>
+          <w:tcPr>
+            <w:tcW w:type="dxa" w:w="752"/>
+          </w:tcPr>
+          <w:p>
+            <w:pPr>
+              <w:spacing w:before="20" w:after="20"/>
+              <w:jc w:val="center"/>
+            </w:pPr>
+            <w:r/>
+            <w:r>
+              <w:rPr>
+                <w:rFonts w:ascii="Times New Roman" w:hAnsi="Times New Roman" w:eastAsia="Times New Roman"/>
+                <w:b w:val="0"/>
+                <w:sz w:val="13"/>
+              </w:rPr>
+              <w:t>0.9933</w:t>
+            </w:r>
+          </w:p>
+        </w:tc>
+        <w:tc>
+          <w:tcPr>
+            <w:tcW w:type="dxa" w:w="752"/>
+          </w:tcPr>
+          <w:p>
+            <w:pPr>
+              <w:spacing w:before="20" w:after="20"/>
+              <w:jc w:val="center"/>
+            </w:pPr>
+            <w:r/>
+            <w:r>
+              <w:rPr>
+                <w:rFonts w:ascii="Times New Roman" w:hAnsi="Times New Roman" w:eastAsia="Times New Roman"/>
+                <w:b w:val="0"/>
+                <w:sz w:val="13"/>
+              </w:rPr>
+              <w:t>0.9933</w:t>
+            </w:r>
+          </w:p>
+        </w:tc>
+      </w:tr>
+      <w:tr>
+        <w:trPr>
+          <w:cantSplit w:val="true"/>
+        </w:trPr>
+        <w:tc>
+          <w:tcPr>
+            <w:tcW w:type="dxa" w:w="752"/>
+            <w:vMerge w:val="restart"/>
+          </w:tcPr>
+          <w:p>
+            <w:pPr>
+              <w:spacing w:before="20" w:after="20"/>
+              <w:jc w:val="center"/>
+            </w:pPr>
+            <w:r>
+              <w:rPr>
+                <w:rFonts w:ascii="Times New Roman" w:hAnsi="Times New Roman" w:eastAsia="Times New Roman"/>
+                <w:b w:val="0"/>
+                <w:sz w:val="13"/>
+              </w:rPr>
+              <w:t>DeBERTa</w:t>
+              <w:br/>
+              <w:t>(BERT variation)</w:t>
+            </w:r>
+          </w:p>
+        </w:tc>
+        <w:tc>
+          <w:tcPr>
+            <w:tcW w:type="dxa" w:w="752"/>
+          </w:tcPr>
+          <w:p>
+            <w:pPr>
+              <w:spacing w:before="20" w:after="20"/>
+              <w:jc w:val="center"/>
+            </w:pPr>
+            <w:r/>
+            <w:r>
+              <w:rPr>
+                <w:rFonts w:ascii="Times New Roman" w:hAnsi="Times New Roman" w:eastAsia="Times New Roman"/>
+                <w:b w:val="0"/>
+                <w:sz w:val="13"/>
+              </w:rPr>
+              <w:t>0.00002</w:t>
+            </w:r>
+          </w:p>
+        </w:tc>
+        <w:tc>
+          <w:tcPr>
+            <w:tcW w:type="dxa" w:w="752"/>
+          </w:tcPr>
+          <w:p>
+            <w:pPr>
+              <w:spacing w:before="20" w:after="20"/>
+              <w:jc w:val="center"/>
+            </w:pPr>
+            <w:r/>
+            <w:r>
+              <w:rPr>
+                <w:rFonts w:ascii="Times New Roman" w:hAnsi="Times New Roman" w:eastAsia="Times New Roman"/>
+                <w:b w:val="0"/>
+                <w:sz w:val="13"/>
+              </w:rPr>
+              <w:t>16</w:t>
+            </w:r>
+          </w:p>
+        </w:tc>
+        <w:tc>
+          <w:tcPr>
+            <w:tcW w:type="dxa" w:w="752"/>
+          </w:tcPr>
+          <w:p>
+            <w:pPr>
+              <w:spacing w:before="20" w:after="20"/>
+              <w:jc w:val="center"/>
+            </w:pPr>
+            <w:r/>
+            <w:r>
+              <w:rPr>
+                <w:rFonts w:ascii="Times New Roman" w:hAnsi="Times New Roman" w:eastAsia="Times New Roman"/>
+                <w:b w:val="0"/>
+                <w:sz w:val="13"/>
+              </w:rPr>
+              <w:t>0.01</w:t>
+            </w:r>
+          </w:p>
+        </w:tc>
+        <w:tc>
+          <w:tcPr>
+            <w:tcW w:type="dxa" w:w="752"/>
+          </w:tcPr>
+          <w:p>
+            <w:pPr>
+              <w:spacing w:before="20" w:after="20"/>
+              <w:jc w:val="center"/>
+            </w:pPr>
+            <w:r/>
+            <w:r>
+              <w:rPr>
+                <w:rFonts w:ascii="Times New Roman" w:hAnsi="Times New Roman" w:eastAsia="Times New Roman"/>
+                <w:b w:val="0"/>
+                <w:sz w:val="13"/>
+              </w:rPr>
+              <w:t>0.9953</w:t>
+            </w:r>
+          </w:p>
+        </w:tc>
+        <w:tc>
+          <w:tcPr>
+            <w:tcW w:type="dxa" w:w="752"/>
+          </w:tcPr>
+          <w:p>
+            <w:pPr>
+              <w:spacing w:before="20" w:after="20"/>
+              <w:jc w:val="center"/>
+            </w:pPr>
+            <w:r/>
+            <w:r>
+              <w:rPr>
+                <w:rFonts w:ascii="Times New Roman" w:hAnsi="Times New Roman" w:eastAsia="Times New Roman"/>
+                <w:b w:val="0"/>
+                <w:sz w:val="13"/>
+              </w:rPr>
+              <w:t>0.9953</w:t>
+            </w:r>
+          </w:p>
+        </w:tc>
+        <w:tc>
+          <w:tcPr>
+            <w:tcW w:type="dxa" w:w="752"/>
+          </w:tcPr>
+          <w:p>
+            <w:pPr>
+              <w:spacing w:before="20" w:after="20"/>
+              <w:jc w:val="center"/>
+            </w:pPr>
+            <w:r/>
+            <w:r>
+              <w:rPr>
+                <w:rFonts w:ascii="Times New Roman" w:hAnsi="Times New Roman" w:eastAsia="Times New Roman"/>
+                <w:b w:val="0"/>
+                <w:sz w:val="13"/>
+              </w:rPr>
+              <w:t>0.9953</w:t>
+            </w:r>
+          </w:p>
+        </w:tc>
+        <w:tc>
+          <w:tcPr>
+            <w:tcW w:type="dxa" w:w="752"/>
+          </w:tcPr>
+          <w:p>
+            <w:pPr>
+              <w:spacing w:before="20" w:after="20"/>
+              <w:jc w:val="center"/>
+            </w:pPr>
+            <w:r/>
+            <w:r>
+              <w:rPr>
+                <w:rFonts w:ascii="Times New Roman" w:hAnsi="Times New Roman" w:eastAsia="Times New Roman"/>
+                <w:b w:val="0"/>
+                <w:sz w:val="13"/>
+              </w:rPr>
+              <w:t>0.9953</w:t>
+            </w:r>
+          </w:p>
+        </w:tc>
+        <w:tc>
+          <w:tcPr>
+            <w:tcW w:type="dxa" w:w="752"/>
+          </w:tcPr>
+          <w:p>
+            <w:pPr>
+              <w:spacing w:before="20" w:after="20"/>
+              <w:jc w:val="center"/>
+            </w:pPr>
+            <w:r/>
+            <w:r>
+              <w:rPr>
+                <w:rFonts w:ascii="Times New Roman" w:hAnsi="Times New Roman" w:eastAsia="Times New Roman"/>
+                <w:b w:val="0"/>
+                <w:sz w:val="13"/>
+              </w:rPr>
+              <w:t>0.9937</w:t>
+            </w:r>
+          </w:p>
+        </w:tc>
+        <w:tc>
+          <w:tcPr>
+            <w:tcW w:type="dxa" w:w="752"/>
+          </w:tcPr>
+          <w:p>
+            <w:pPr>
+              <w:spacing w:before="20" w:after="20"/>
+              <w:jc w:val="center"/>
+            </w:pPr>
+            <w:r/>
+            <w:r>
+              <w:rPr>
+                <w:rFonts w:ascii="Times New Roman" w:hAnsi="Times New Roman" w:eastAsia="Times New Roman"/>
+                <w:b w:val="0"/>
+                <w:sz w:val="13"/>
+              </w:rPr>
+              <w:t>0.9937</w:t>
+            </w:r>
+          </w:p>
+        </w:tc>
+        <w:tc>
+          <w:tcPr>
+            <w:tcW w:type="dxa" w:w="752"/>
+          </w:tcPr>
+          <w:p>
+            <w:pPr>
+              <w:spacing w:before="20" w:after="20"/>
+              <w:jc w:val="center"/>
+            </w:pPr>
+            <w:r/>
+            <w:r>
+              <w:rPr>
+                <w:rFonts w:ascii="Times New Roman" w:hAnsi="Times New Roman" w:eastAsia="Times New Roman"/>
+                <w:b w:val="0"/>
+                <w:sz w:val="13"/>
+              </w:rPr>
+              <w:t>0.9937</w:t>
+            </w:r>
+          </w:p>
+        </w:tc>
+        <w:tc>
+          <w:tcPr>
+            <w:tcW w:type="dxa" w:w="752"/>
+          </w:tcPr>
+          <w:p>
+            <w:pPr>
+              <w:spacing w:before="20" w:after="20"/>
+              <w:jc w:val="center"/>
+            </w:pPr>
+            <w:r/>
+            <w:r>
+              <w:rPr>
+                <w:rFonts w:ascii="Times New Roman" w:hAnsi="Times New Roman" w:eastAsia="Times New Roman"/>
+                <w:b w:val="0"/>
+                <w:sz w:val="13"/>
+              </w:rPr>
+              <w:t>0.9937</w:t>
+            </w:r>
+          </w:p>
+        </w:tc>
+      </w:tr>
+      <w:tr>
+        <w:trPr>
+          <w:cantSplit w:val="true"/>
+        </w:trPr>
+        <w:tc>
+          <w:tcPr>
+            <w:tcW w:type="dxa" w:w="752"/>
+            <w:vMerge/>
+          </w:tcPr>
+          <w:p/>
+        </w:tc>
+        <w:tc>
+          <w:tcPr>
+            <w:tcW w:type="dxa" w:w="752"/>
+          </w:tcPr>
+          <w:p>
+            <w:pPr>
+              <w:spacing w:before="20" w:after="20"/>
+              <w:jc w:val="center"/>
+            </w:pPr>
+            <w:r/>
+            <w:r>
+              <w:rPr>
+                <w:rFonts w:ascii="Times New Roman" w:hAnsi="Times New Roman" w:eastAsia="Times New Roman"/>
+                <w:b w:val="0"/>
+                <w:sz w:val="13"/>
+              </w:rPr>
+              <w:t>0.00003</w:t>
+            </w:r>
+          </w:p>
+        </w:tc>
+        <w:tc>
+          <w:tcPr>
+            <w:tcW w:type="dxa" w:w="752"/>
+          </w:tcPr>
+          <w:p>
+            <w:pPr>
+              <w:spacing w:before="20" w:after="20"/>
+              <w:jc w:val="center"/>
+            </w:pPr>
+            <w:r/>
+            <w:r>
+              <w:rPr>
+                <w:rFonts w:ascii="Times New Roman" w:hAnsi="Times New Roman" w:eastAsia="Times New Roman"/>
+                <w:b w:val="0"/>
+                <w:sz w:val="13"/>
+              </w:rPr>
+              <w:t>16</w:t>
+            </w:r>
+          </w:p>
+        </w:tc>
+        <w:tc>
+          <w:tcPr>
+            <w:tcW w:type="dxa" w:w="752"/>
+          </w:tcPr>
+          <w:p>
+            <w:pPr>
+              <w:spacing w:before="20" w:after="20"/>
+              <w:jc w:val="center"/>
+            </w:pPr>
+            <w:r/>
+            <w:r>
+              <w:rPr>
+                <w:rFonts w:ascii="Times New Roman" w:hAnsi="Times New Roman" w:eastAsia="Times New Roman"/>
+                <w:b w:val="0"/>
+                <w:sz w:val="13"/>
+              </w:rPr>
+              <w:t>0.01</w:t>
+            </w:r>
+          </w:p>
+        </w:tc>
+        <w:tc>
+          <w:tcPr>
+            <w:tcW w:type="dxa" w:w="752"/>
+          </w:tcPr>
+          <w:p>
+            <w:pPr>
+              <w:spacing w:before="20" w:after="20"/>
+              <w:jc w:val="center"/>
+            </w:pPr>
+            <w:r/>
+            <w:r>
+              <w:rPr>
+                <w:rFonts w:ascii="Times New Roman" w:hAnsi="Times New Roman" w:eastAsia="Times New Roman"/>
+                <w:b w:val="0"/>
+                <w:sz w:val="13"/>
+              </w:rPr>
+              <w:t>0.9917</w:t>
+            </w:r>
+          </w:p>
+        </w:tc>
+        <w:tc>
+          <w:tcPr>
+            <w:tcW w:type="dxa" w:w="752"/>
+          </w:tcPr>
+          <w:p>
+            <w:pPr>
+              <w:spacing w:before="20" w:after="20"/>
+              <w:jc w:val="center"/>
+            </w:pPr>
+            <w:r/>
+            <w:r>
+              <w:rPr>
+                <w:rFonts w:ascii="Times New Roman" w:hAnsi="Times New Roman" w:eastAsia="Times New Roman"/>
+                <w:b w:val="0"/>
+                <w:sz w:val="13"/>
+              </w:rPr>
+              <w:t>0.9917</w:t>
+            </w:r>
+          </w:p>
+        </w:tc>
+        <w:tc>
+          <w:tcPr>
+            <w:tcW w:type="dxa" w:w="752"/>
+          </w:tcPr>
+          <w:p>
+            <w:pPr>
+              <w:spacing w:before="20" w:after="20"/>
+              <w:jc w:val="center"/>
+            </w:pPr>
+            <w:r/>
+            <w:r>
+              <w:rPr>
+                <w:rFonts w:ascii="Times New Roman" w:hAnsi="Times New Roman" w:eastAsia="Times New Roman"/>
+                <w:b w:val="0"/>
+                <w:sz w:val="13"/>
+              </w:rPr>
+              <w:t>0.9917</w:t>
+            </w:r>
+          </w:p>
+        </w:tc>
+        <w:tc>
+          <w:tcPr>
+            <w:tcW w:type="dxa" w:w="752"/>
+          </w:tcPr>
+          <w:p>
+            <w:pPr>
+              <w:spacing w:before="20" w:after="20"/>
+              <w:jc w:val="center"/>
+            </w:pPr>
+            <w:r/>
+            <w:r>
+              <w:rPr>
+                <w:rFonts w:ascii="Times New Roman" w:hAnsi="Times New Roman" w:eastAsia="Times New Roman"/>
+                <w:b w:val="0"/>
+                <w:sz w:val="13"/>
+              </w:rPr>
+              <w:t>0.9917</w:t>
+            </w:r>
+          </w:p>
+        </w:tc>
+        <w:tc>
+          <w:tcPr>
+            <w:tcW w:type="dxa" w:w="752"/>
+          </w:tcPr>
+          <w:p>
+            <w:pPr>
+              <w:spacing w:before="20" w:after="20"/>
+              <w:jc w:val="center"/>
+            </w:pPr>
+            <w:r/>
+            <w:r>
+              <w:rPr>
+                <w:rFonts w:ascii="Times New Roman" w:hAnsi="Times New Roman" w:eastAsia="Times New Roman"/>
+                <w:b w:val="0"/>
+                <w:sz w:val="13"/>
+              </w:rPr>
+              <w:t>0.9980</w:t>
+            </w:r>
+          </w:p>
+        </w:tc>
+        <w:tc>
+          <w:tcPr>
+            <w:tcW w:type="dxa" w:w="752"/>
+          </w:tcPr>
+          <w:p>
+            <w:pPr>
+              <w:spacing w:before="20" w:after="20"/>
+              <w:jc w:val="center"/>
+            </w:pPr>
+            <w:r/>
+            <w:r>
+              <w:rPr>
+                <w:rFonts w:ascii="Times New Roman" w:hAnsi="Times New Roman" w:eastAsia="Times New Roman"/>
+                <w:b w:val="0"/>
+                <w:sz w:val="13"/>
+              </w:rPr>
+              <w:t>0.9980</w:t>
+            </w:r>
+          </w:p>
+        </w:tc>
+        <w:tc>
+          <w:tcPr>
+            <w:tcW w:type="dxa" w:w="752"/>
+          </w:tcPr>
+          <w:p>
+            <w:pPr>
+              <w:spacing w:before="20" w:after="20"/>
+              <w:jc w:val="center"/>
+            </w:pPr>
+            <w:r/>
+            <w:r>
+              <w:rPr>
+                <w:rFonts w:ascii="Times New Roman" w:hAnsi="Times New Roman" w:eastAsia="Times New Roman"/>
+                <w:b w:val="0"/>
+                <w:sz w:val="13"/>
+              </w:rPr>
+              <w:t>0.9980</w:t>
+            </w:r>
+          </w:p>
+        </w:tc>
+        <w:tc>
+          <w:tcPr>
+            <w:tcW w:type="dxa" w:w="752"/>
+          </w:tcPr>
+          <w:p>
+            <w:pPr>
+              <w:spacing w:before="20" w:after="20"/>
+              <w:jc w:val="center"/>
+            </w:pPr>
+            <w:r/>
+            <w:r>
+              <w:rPr>
+                <w:rFonts w:ascii="Times New Roman" w:hAnsi="Times New Roman" w:eastAsia="Times New Roman"/>
+                <w:b w:val="0"/>
+                <w:sz w:val="13"/>
+              </w:rPr>
+              <w:t>0.9980</w:t>
+            </w:r>
+          </w:p>
+        </w:tc>
+      </w:tr>
+      <w:tr>
+        <w:trPr>
+          <w:cantSplit w:val="true"/>
+        </w:trPr>
+        <w:tc>
+          <w:tcPr>
+            <w:tcW w:type="dxa" w:w="752"/>
+            <w:vMerge/>
+          </w:tcPr>
+          <w:p/>
+        </w:tc>
+        <w:tc>
+          <w:tcPr>
+            <w:tcW w:type="dxa" w:w="752"/>
+          </w:tcPr>
+          <w:p>
+            <w:pPr>
+              <w:spacing w:before="20" w:after="20"/>
+              <w:jc w:val="center"/>
+            </w:pPr>
+            <w:r/>
+            <w:r>
+              <w:rPr>
+                <w:rFonts w:ascii="Times New Roman" w:hAnsi="Times New Roman" w:eastAsia="Times New Roman"/>
+                <w:b w:val="0"/>
+                <w:sz w:val="13"/>
+              </w:rPr>
+              <w:t>0.00002</w:t>
+            </w:r>
+          </w:p>
+        </w:tc>
+        <w:tc>
+          <w:tcPr>
+            <w:tcW w:type="dxa" w:w="752"/>
+          </w:tcPr>
+          <w:p>
+            <w:pPr>
+              <w:spacing w:before="20" w:after="20"/>
+              <w:jc w:val="center"/>
+            </w:pPr>
+            <w:r/>
+            <w:r>
+              <w:rPr>
+                <w:rFonts w:ascii="Times New Roman" w:hAnsi="Times New Roman" w:eastAsia="Times New Roman"/>
+                <w:b w:val="0"/>
+                <w:sz w:val="13"/>
+              </w:rPr>
+              <w:t>32</w:t>
+            </w:r>
+          </w:p>
+        </w:tc>
+        <w:tc>
+          <w:tcPr>
+            <w:tcW w:type="dxa" w:w="752"/>
+          </w:tcPr>
+          <w:p>
+            <w:pPr>
+              <w:spacing w:before="20" w:after="20"/>
+              <w:jc w:val="center"/>
+            </w:pPr>
+            <w:r/>
+            <w:r>
+              <w:rPr>
+                <w:rFonts w:ascii="Times New Roman" w:hAnsi="Times New Roman" w:eastAsia="Times New Roman"/>
+                <w:b w:val="0"/>
+                <w:sz w:val="13"/>
+              </w:rPr>
+              <w:t>0.01</w:t>
+            </w:r>
+          </w:p>
+        </w:tc>
+        <w:tc>
+          <w:tcPr>
+            <w:tcW w:type="dxa" w:w="752"/>
+          </w:tcPr>
+          <w:p>
+            <w:pPr>
+              <w:spacing w:before="20" w:after="20"/>
+              <w:jc w:val="center"/>
+            </w:pPr>
+            <w:r/>
+            <w:r>
+              <w:rPr>
+                <w:rFonts w:ascii="Times New Roman" w:hAnsi="Times New Roman" w:eastAsia="Times New Roman"/>
+                <w:b w:val="0"/>
+                <w:sz w:val="13"/>
+              </w:rPr>
+              <w:t>0.9930</w:t>
+            </w:r>
+          </w:p>
+        </w:tc>
+        <w:tc>
+          <w:tcPr>
+            <w:tcW w:type="dxa" w:w="752"/>
+          </w:tcPr>
+          <w:p>
+            <w:pPr>
+              <w:spacing w:before="20" w:after="20"/>
+              <w:jc w:val="center"/>
+            </w:pPr>
+            <w:r/>
+            <w:r>
+              <w:rPr>
+                <w:rFonts w:ascii="Times New Roman" w:hAnsi="Times New Roman" w:eastAsia="Times New Roman"/>
+                <w:b w:val="0"/>
+                <w:sz w:val="13"/>
+              </w:rPr>
+              <w:t>0.9930</w:t>
+            </w:r>
+          </w:p>
+        </w:tc>
+        <w:tc>
+          <w:tcPr>
+            <w:tcW w:type="dxa" w:w="752"/>
+          </w:tcPr>
+          <w:p>
+            <w:pPr>
+              <w:spacing w:before="20" w:after="20"/>
+              <w:jc w:val="center"/>
+            </w:pPr>
+            <w:r/>
+            <w:r>
+              <w:rPr>
+                <w:rFonts w:ascii="Times New Roman" w:hAnsi="Times New Roman" w:eastAsia="Times New Roman"/>
+                <w:b w:val="0"/>
+                <w:sz w:val="13"/>
+              </w:rPr>
+              <w:t>0.9930</w:t>
+            </w:r>
+          </w:p>
+        </w:tc>
+        <w:tc>
+          <w:tcPr>
+            <w:tcW w:type="dxa" w:w="752"/>
+          </w:tcPr>
+          <w:p>
+            <w:pPr>
+              <w:spacing w:before="20" w:after="20"/>
+              <w:jc w:val="center"/>
+            </w:pPr>
+            <w:r/>
+            <w:r>
+              <w:rPr>
+                <w:rFonts w:ascii="Times New Roman" w:hAnsi="Times New Roman" w:eastAsia="Times New Roman"/>
+                <w:b w:val="0"/>
+                <w:sz w:val="13"/>
+              </w:rPr>
+              <w:t>0.9930</w:t>
+            </w:r>
+          </w:p>
+        </w:tc>
+        <w:tc>
+          <w:tcPr>
+            <w:tcW w:type="dxa" w:w="752"/>
+          </w:tcPr>
+          <w:p>
+            <w:pPr>
+              <w:spacing w:before="20" w:after="20"/>
+              <w:jc w:val="center"/>
+            </w:pPr>
+            <w:r/>
+            <w:r>
+              <w:rPr>
+                <w:rFonts w:ascii="Times New Roman" w:hAnsi="Times New Roman" w:eastAsia="Times New Roman"/>
+                <w:b w:val="0"/>
+                <w:sz w:val="13"/>
+              </w:rPr>
+              <w:t>0.9953</w:t>
+            </w:r>
+          </w:p>
+        </w:tc>
+        <w:tc>
+          <w:tcPr>
+            <w:tcW w:type="dxa" w:w="752"/>
+          </w:tcPr>
+          <w:p>
+            <w:pPr>
+              <w:spacing w:before="20" w:after="20"/>
+              <w:jc w:val="center"/>
+            </w:pPr>
+            <w:r/>
+            <w:r>
+              <w:rPr>
+                <w:rFonts w:ascii="Times New Roman" w:hAnsi="Times New Roman" w:eastAsia="Times New Roman"/>
+                <w:b w:val="0"/>
+                <w:sz w:val="13"/>
+              </w:rPr>
+              <w:t>0.9954</w:t>
+            </w:r>
+          </w:p>
+        </w:tc>
+        <w:tc>
+          <w:tcPr>
+            <w:tcW w:type="dxa" w:w="752"/>
+          </w:tcPr>
+          <w:p>
+            <w:pPr>
+              <w:spacing w:before="20" w:after="20"/>
+              <w:jc w:val="center"/>
+            </w:pPr>
+            <w:r/>
+            <w:r>
+              <w:rPr>
+                <w:rFonts w:ascii="Times New Roman" w:hAnsi="Times New Roman" w:eastAsia="Times New Roman"/>
+                <w:b w:val="0"/>
+                <w:sz w:val="13"/>
+              </w:rPr>
+              <w:t>0.9953</w:t>
+            </w:r>
+          </w:p>
+        </w:tc>
+        <w:tc>
+          <w:tcPr>
+            <w:tcW w:type="dxa" w:w="752"/>
+          </w:tcPr>
+          <w:p>
+            <w:pPr>
+              <w:spacing w:before="20" w:after="20"/>
+              <w:jc w:val="center"/>
+            </w:pPr>
+            <w:r/>
+            <w:r>
+              <w:rPr>
+                <w:rFonts w:ascii="Times New Roman" w:hAnsi="Times New Roman" w:eastAsia="Times New Roman"/>
+                <w:b w:val="0"/>
+                <w:sz w:val="13"/>
+              </w:rPr>
+              <w:t>0.9953</w:t>
+            </w:r>
+          </w:p>
+        </w:tc>
+      </w:tr>
+      <w:tr>
+        <w:trPr>
+          <w:cantSplit w:val="true"/>
+        </w:trPr>
+        <w:tc>
+          <w:tcPr>
+            <w:tcW w:type="dxa" w:w="752"/>
+            <w:vMerge/>
+          </w:tcPr>
+          <w:p/>
+        </w:tc>
+        <w:tc>
+          <w:tcPr>
+            <w:tcW w:type="dxa" w:w="752"/>
+          </w:tcPr>
+          <w:p>
+            <w:pPr>
+              <w:spacing w:before="20" w:after="20"/>
+              <w:jc w:val="center"/>
+            </w:pPr>
+            <w:r/>
+            <w:r>
+              <w:rPr>
+                <w:rFonts w:ascii="Times New Roman" w:hAnsi="Times New Roman" w:eastAsia="Times New Roman"/>
+                <w:b w:val="0"/>
+                <w:sz w:val="13"/>
+              </w:rPr>
+              <w:t>0.00003</w:t>
+            </w:r>
+          </w:p>
+        </w:tc>
+        <w:tc>
+          <w:tcPr>
+            <w:tcW w:type="dxa" w:w="752"/>
+          </w:tcPr>
+          <w:p>
+            <w:pPr>
+              <w:spacing w:before="20" w:after="20"/>
+              <w:jc w:val="center"/>
+            </w:pPr>
+            <w:r/>
+            <w:r>
+              <w:rPr>
+                <w:rFonts w:ascii="Times New Roman" w:hAnsi="Times New Roman" w:eastAsia="Times New Roman"/>
+                <w:b w:val="0"/>
+                <w:sz w:val="13"/>
+              </w:rPr>
+              <w:t>32</w:t>
+            </w:r>
+          </w:p>
+        </w:tc>
+        <w:tc>
+          <w:tcPr>
+            <w:tcW w:type="dxa" w:w="752"/>
+          </w:tcPr>
+          <w:p>
+            <w:pPr>
+              <w:spacing w:before="20" w:after="20"/>
+              <w:jc w:val="center"/>
+            </w:pPr>
+            <w:r/>
+            <w:r>
+              <w:rPr>
+                <w:rFonts w:ascii="Times New Roman" w:hAnsi="Times New Roman" w:eastAsia="Times New Roman"/>
+                <w:b w:val="0"/>
+                <w:sz w:val="13"/>
+              </w:rPr>
+              <w:t>0.01</w:t>
+            </w:r>
+          </w:p>
+        </w:tc>
+        <w:tc>
+          <w:tcPr>
+            <w:tcW w:type="dxa" w:w="752"/>
+          </w:tcPr>
+          <w:p>
+            <w:pPr>
+              <w:spacing w:before="20" w:after="20"/>
+              <w:jc w:val="center"/>
+            </w:pPr>
+            <w:r/>
+            <w:r>
+              <w:rPr>
+                <w:rFonts w:ascii="Times New Roman" w:hAnsi="Times New Roman" w:eastAsia="Times New Roman"/>
+                <w:b w:val="0"/>
+                <w:sz w:val="13"/>
+              </w:rPr>
+              <w:t>0.9920</w:t>
+            </w:r>
+          </w:p>
+        </w:tc>
+        <w:tc>
+          <w:tcPr>
+            <w:tcW w:type="dxa" w:w="752"/>
+          </w:tcPr>
+          <w:p>
+            <w:pPr>
+              <w:spacing w:before="20" w:after="20"/>
+              <w:jc w:val="center"/>
+            </w:pPr>
+            <w:r/>
+            <w:r>
+              <w:rPr>
+                <w:rFonts w:ascii="Times New Roman" w:hAnsi="Times New Roman" w:eastAsia="Times New Roman"/>
+                <w:b w:val="0"/>
+                <w:sz w:val="13"/>
+              </w:rPr>
+              <w:t>0.9921</w:t>
+            </w:r>
+          </w:p>
+        </w:tc>
+        <w:tc>
+          <w:tcPr>
+            <w:tcW w:type="dxa" w:w="752"/>
+          </w:tcPr>
+          <w:p>
+            <w:pPr>
+              <w:spacing w:before="20" w:after="20"/>
+              <w:jc w:val="center"/>
+            </w:pPr>
+            <w:r/>
+            <w:r>
+              <w:rPr>
+                <w:rFonts w:ascii="Times New Roman" w:hAnsi="Times New Roman" w:eastAsia="Times New Roman"/>
+                <w:b w:val="0"/>
+                <w:sz w:val="13"/>
+              </w:rPr>
+              <w:t>0.9920</w:t>
+            </w:r>
+          </w:p>
+        </w:tc>
+        <w:tc>
+          <w:tcPr>
+            <w:tcW w:type="dxa" w:w="752"/>
+          </w:tcPr>
+          <w:p>
+            <w:pPr>
+              <w:spacing w:before="20" w:after="20"/>
+              <w:jc w:val="center"/>
+            </w:pPr>
+            <w:r/>
+            <w:r>
+              <w:rPr>
+                <w:rFonts w:ascii="Times New Roman" w:hAnsi="Times New Roman" w:eastAsia="Times New Roman"/>
+                <w:b w:val="0"/>
+                <w:sz w:val="13"/>
+              </w:rPr>
+              <w:t>0.9920</w:t>
+            </w:r>
+          </w:p>
+        </w:tc>
+        <w:tc>
+          <w:tcPr>
+            <w:tcW w:type="dxa" w:w="752"/>
+          </w:tcPr>
+          <w:p>
+            <w:pPr>
+              <w:spacing w:before="20" w:after="20"/>
+              <w:jc w:val="center"/>
+            </w:pPr>
+            <w:r/>
+            <w:r>
+              <w:rPr>
+                <w:rFonts w:ascii="Times New Roman" w:hAnsi="Times New Roman" w:eastAsia="Times New Roman"/>
+                <w:b w:val="0"/>
+                <w:sz w:val="13"/>
+              </w:rPr>
+              <w:t>0.9964</w:t>
+            </w:r>
+          </w:p>
+        </w:tc>
+        <w:tc>
+          <w:tcPr>
+            <w:tcW w:type="dxa" w:w="752"/>
+          </w:tcPr>
+          <w:p>
+            <w:pPr>
+              <w:spacing w:before="20" w:after="20"/>
+              <w:jc w:val="center"/>
+            </w:pPr>
+            <w:r/>
+            <w:r>
+              <w:rPr>
+                <w:rFonts w:ascii="Times New Roman" w:hAnsi="Times New Roman" w:eastAsia="Times New Roman"/>
+                <w:b w:val="0"/>
+                <w:sz w:val="13"/>
+              </w:rPr>
+              <w:t>0.9964</w:t>
+            </w:r>
+          </w:p>
+        </w:tc>
+        <w:tc>
+          <w:tcPr>
+            <w:tcW w:type="dxa" w:w="752"/>
+          </w:tcPr>
+          <w:p>
+            <w:pPr>
+              <w:spacing w:before="20" w:after="20"/>
+              <w:jc w:val="center"/>
+            </w:pPr>
+            <w:r/>
+            <w:r>
+              <w:rPr>
+                <w:rFonts w:ascii="Times New Roman" w:hAnsi="Times New Roman" w:eastAsia="Times New Roman"/>
+                <w:b w:val="0"/>
+                <w:sz w:val="13"/>
+              </w:rPr>
+              <w:t>0.9964</w:t>
+            </w:r>
+          </w:p>
+        </w:tc>
+        <w:tc>
+          <w:tcPr>
+            <w:tcW w:type="dxa" w:w="752"/>
+          </w:tcPr>
+          <w:p>
+            <w:pPr>
+              <w:spacing w:before="20" w:after="20"/>
+              <w:jc w:val="center"/>
+            </w:pPr>
+            <w:r/>
+            <w:r>
+              <w:rPr>
+                <w:rFonts w:ascii="Times New Roman" w:hAnsi="Times New Roman" w:eastAsia="Times New Roman"/>
+                <w:b w:val="0"/>
+                <w:sz w:val="13"/>
+              </w:rPr>
+              <w:t>0.9964</w:t>
+            </w:r>
+          </w:p>
+        </w:tc>
+      </w:tr>
+      <w:tr>
+        <w:trPr>
+          <w:cantSplit w:val="true"/>
+        </w:trPr>
+        <w:tc>
+          <w:tcPr>
+            <w:tcW w:type="dxa" w:w="752"/>
+            <w:vMerge/>
+          </w:tcPr>
+          <w:p/>
+        </w:tc>
+        <w:tc>
+          <w:tcPr>
+            <w:tcW w:type="dxa" w:w="752"/>
+          </w:tcPr>
+          <w:p>
+            <w:pPr>
+              <w:spacing w:before="20" w:after="20"/>
+              <w:jc w:val="center"/>
+            </w:pPr>
+            <w:r/>
+            <w:r>
+              <w:rPr>
+                <w:rFonts w:ascii="Times New Roman" w:hAnsi="Times New Roman" w:eastAsia="Times New Roman"/>
+                <w:b w:val="0"/>
+                <w:sz w:val="13"/>
+              </w:rPr>
+              <w:t>0.00002</w:t>
+            </w:r>
+          </w:p>
+        </w:tc>
+        <w:tc>
+          <w:tcPr>
+            <w:tcW w:type="dxa" w:w="752"/>
+          </w:tcPr>
+          <w:p>
+            <w:pPr>
+              <w:spacing w:before="20" w:after="20"/>
+              <w:jc w:val="center"/>
+            </w:pPr>
+            <w:r/>
+            <w:r>
+              <w:rPr>
+                <w:rFonts w:ascii="Times New Roman" w:hAnsi="Times New Roman" w:eastAsia="Times New Roman"/>
+                <w:b w:val="0"/>
+                <w:sz w:val="13"/>
+              </w:rPr>
+              <w:t>16</w:t>
+            </w:r>
+          </w:p>
+        </w:tc>
+        <w:tc>
+          <w:tcPr>
+            <w:tcW w:type="dxa" w:w="752"/>
+          </w:tcPr>
+          <w:p>
+            <w:pPr>
+              <w:spacing w:before="20" w:after="20"/>
+              <w:jc w:val="center"/>
+            </w:pPr>
+            <w:r/>
+            <w:r>
+              <w:rPr>
+                <w:rFonts w:ascii="Times New Roman" w:hAnsi="Times New Roman" w:eastAsia="Times New Roman"/>
+                <w:b w:val="0"/>
+                <w:sz w:val="13"/>
+              </w:rPr>
+              <w:t>0.1</w:t>
+            </w:r>
+          </w:p>
+        </w:tc>
+        <w:tc>
+          <w:tcPr>
+            <w:tcW w:type="dxa" w:w="752"/>
+          </w:tcPr>
+          <w:p>
+            <w:pPr>
+              <w:spacing w:before="20" w:after="20"/>
+              <w:jc w:val="center"/>
+            </w:pPr>
+            <w:r/>
+            <w:r>
+              <w:rPr>
+                <w:rFonts w:ascii="Times New Roman" w:hAnsi="Times New Roman" w:eastAsia="Times New Roman"/>
+                <w:b w:val="0"/>
+                <w:sz w:val="13"/>
+              </w:rPr>
+              <w:t>0.9940</w:t>
+            </w:r>
+          </w:p>
+        </w:tc>
+        <w:tc>
+          <w:tcPr>
+            <w:tcW w:type="dxa" w:w="752"/>
+          </w:tcPr>
+          <w:p>
+            <w:pPr>
+              <w:spacing w:before="20" w:after="20"/>
+              <w:jc w:val="center"/>
+            </w:pPr>
+            <w:r/>
+            <w:r>
+              <w:rPr>
+                <w:rFonts w:ascii="Times New Roman" w:hAnsi="Times New Roman" w:eastAsia="Times New Roman"/>
+                <w:b w:val="0"/>
+                <w:sz w:val="13"/>
+              </w:rPr>
+              <w:t>0.9940</w:t>
+            </w:r>
+          </w:p>
+        </w:tc>
+        <w:tc>
+          <w:tcPr>
+            <w:tcW w:type="dxa" w:w="752"/>
+          </w:tcPr>
+          <w:p>
+            <w:pPr>
+              <w:spacing w:before="20" w:after="20"/>
+              <w:jc w:val="center"/>
+            </w:pPr>
+            <w:r/>
+            <w:r>
+              <w:rPr>
+                <w:rFonts w:ascii="Times New Roman" w:hAnsi="Times New Roman" w:eastAsia="Times New Roman"/>
+                <w:b w:val="0"/>
+                <w:sz w:val="13"/>
+              </w:rPr>
+              <w:t>0.9940</w:t>
+            </w:r>
+          </w:p>
+        </w:tc>
+        <w:tc>
+          <w:tcPr>
+            <w:tcW w:type="dxa" w:w="752"/>
+          </w:tcPr>
+          <w:p>
+            <w:pPr>
+              <w:spacing w:before="20" w:after="20"/>
+              <w:jc w:val="center"/>
+            </w:pPr>
+            <w:r/>
+            <w:r>
+              <w:rPr>
+                <w:rFonts w:ascii="Times New Roman" w:hAnsi="Times New Roman" w:eastAsia="Times New Roman"/>
+                <w:b w:val="0"/>
+                <w:sz w:val="13"/>
+              </w:rPr>
+              <w:t>0.9940</w:t>
+            </w:r>
+          </w:p>
+        </w:tc>
+        <w:tc>
+          <w:tcPr>
+            <w:tcW w:type="dxa" w:w="752"/>
+          </w:tcPr>
+          <w:p>
+            <w:pPr>
+              <w:spacing w:before="20" w:after="20"/>
+              <w:jc w:val="center"/>
+            </w:pPr>
+            <w:r/>
+            <w:r>
+              <w:rPr>
+                <w:rFonts w:ascii="Times New Roman" w:hAnsi="Times New Roman" w:eastAsia="Times New Roman"/>
+                <w:b w:val="0"/>
+                <w:sz w:val="13"/>
+              </w:rPr>
+              <w:t>0.9952</w:t>
+            </w:r>
+          </w:p>
+        </w:tc>
+        <w:tc>
+          <w:tcPr>
+            <w:tcW w:type="dxa" w:w="752"/>
+          </w:tcPr>
+          <w:p>
+            <w:pPr>
+              <w:spacing w:before="20" w:after="20"/>
+              <w:jc w:val="center"/>
+            </w:pPr>
+            <w:r/>
+            <w:r>
+              <w:rPr>
+                <w:rFonts w:ascii="Times New Roman" w:hAnsi="Times New Roman" w:eastAsia="Times New Roman"/>
+                <w:b w:val="0"/>
+                <w:sz w:val="13"/>
+              </w:rPr>
+              <w:t>0.9952</w:t>
+            </w:r>
+          </w:p>
+        </w:tc>
+        <w:tc>
+          <w:tcPr>
+            <w:tcW w:type="dxa" w:w="752"/>
+          </w:tcPr>
+          <w:p>
+            <w:pPr>
+              <w:spacing w:before="20" w:after="20"/>
+              <w:jc w:val="center"/>
+            </w:pPr>
+            <w:r/>
+            <w:r>
+              <w:rPr>
+                <w:rFonts w:ascii="Times New Roman" w:hAnsi="Times New Roman" w:eastAsia="Times New Roman"/>
+                <w:b w:val="0"/>
+                <w:sz w:val="13"/>
+              </w:rPr>
+              <w:t>0.9952</w:t>
+            </w:r>
+          </w:p>
+        </w:tc>
+        <w:tc>
+          <w:tcPr>
+            <w:tcW w:type="dxa" w:w="752"/>
+          </w:tcPr>
+          <w:p>
+            <w:pPr>
+              <w:spacing w:before="20" w:after="20"/>
+              <w:jc w:val="center"/>
+            </w:pPr>
+            <w:r/>
+            <w:r>
+              <w:rPr>
+                <w:rFonts w:ascii="Times New Roman" w:hAnsi="Times New Roman" w:eastAsia="Times New Roman"/>
+                <w:b w:val="0"/>
+                <w:sz w:val="13"/>
+              </w:rPr>
+              <w:t>0.9952</w:t>
+            </w:r>
+          </w:p>
+        </w:tc>
+      </w:tr>
+      <w:tr>
+        <w:trPr>
+          <w:cantSplit w:val="true"/>
+        </w:trPr>
+        <w:tc>
+          <w:tcPr>
+            <w:tcW w:type="dxa" w:w="752"/>
+            <w:vMerge/>
+          </w:tcPr>
+          <w:p/>
+        </w:tc>
+        <w:tc>
+          <w:tcPr>
+            <w:tcW w:type="dxa" w:w="752"/>
+          </w:tcPr>
+          <w:p>
+            <w:pPr>
+              <w:spacing w:before="20" w:after="20"/>
+              <w:jc w:val="center"/>
+            </w:pPr>
+            <w:r/>
+            <w:r>
+              <w:rPr>
+                <w:rFonts w:ascii="Times New Roman" w:hAnsi="Times New Roman" w:eastAsia="Times New Roman"/>
+                <w:b w:val="0"/>
+                <w:sz w:val="13"/>
+              </w:rPr>
+              <w:t>0.00003</w:t>
+            </w:r>
+          </w:p>
+        </w:tc>
+        <w:tc>
+          <w:tcPr>
+            <w:tcW w:type="dxa" w:w="752"/>
+          </w:tcPr>
+          <w:p>
+            <w:pPr>
+              <w:spacing w:before="20" w:after="20"/>
+              <w:jc w:val="center"/>
+            </w:pPr>
+            <w:r/>
+            <w:r>
+              <w:rPr>
+                <w:rFonts w:ascii="Times New Roman" w:hAnsi="Times New Roman" w:eastAsia="Times New Roman"/>
+                <w:b w:val="0"/>
+                <w:sz w:val="13"/>
+              </w:rPr>
+              <w:t>16</w:t>
+            </w:r>
+          </w:p>
+        </w:tc>
+        <w:tc>
+          <w:tcPr>
+            <w:tcW w:type="dxa" w:w="752"/>
+          </w:tcPr>
+          <w:p>
+            <w:pPr>
+              <w:spacing w:before="20" w:after="20"/>
+              <w:jc w:val="center"/>
+            </w:pPr>
+            <w:r/>
+            <w:r>
+              <w:rPr>
+                <w:rFonts w:ascii="Times New Roman" w:hAnsi="Times New Roman" w:eastAsia="Times New Roman"/>
+                <w:b w:val="0"/>
+                <w:sz w:val="13"/>
+              </w:rPr>
+              <w:t>0.1</w:t>
+            </w:r>
+          </w:p>
+        </w:tc>
+        <w:tc>
+          <w:tcPr>
+            <w:tcW w:type="dxa" w:w="752"/>
+          </w:tcPr>
+          <w:p>
+            <w:pPr>
+              <w:spacing w:before="20" w:after="20"/>
+              <w:jc w:val="center"/>
+            </w:pPr>
+            <w:r/>
+            <w:r>
+              <w:rPr>
+                <w:rFonts w:ascii="Times New Roman" w:hAnsi="Times New Roman" w:eastAsia="Times New Roman"/>
+                <w:b w:val="0"/>
+                <w:sz w:val="13"/>
+              </w:rPr>
+              <w:t>0.9940</w:t>
+            </w:r>
+          </w:p>
+        </w:tc>
+        <w:tc>
+          <w:tcPr>
+            <w:tcW w:type="dxa" w:w="752"/>
+          </w:tcPr>
+          <w:p>
+            <w:pPr>
+              <w:spacing w:before="20" w:after="20"/>
+              <w:jc w:val="center"/>
+            </w:pPr>
+            <w:r/>
+            <w:r>
+              <w:rPr>
+                <w:rFonts w:ascii="Times New Roman" w:hAnsi="Times New Roman" w:eastAsia="Times New Roman"/>
+                <w:b w:val="0"/>
+                <w:sz w:val="13"/>
+              </w:rPr>
+              <w:t>0.9940</w:t>
+            </w:r>
+          </w:p>
+        </w:tc>
+        <w:tc>
+          <w:tcPr>
+            <w:tcW w:type="dxa" w:w="752"/>
+          </w:tcPr>
+          <w:p>
+            <w:pPr>
+              <w:spacing w:before="20" w:after="20"/>
+              <w:jc w:val="center"/>
+            </w:pPr>
+            <w:r/>
+            <w:r>
+              <w:rPr>
+                <w:rFonts w:ascii="Times New Roman" w:hAnsi="Times New Roman" w:eastAsia="Times New Roman"/>
+                <w:b w:val="0"/>
+                <w:sz w:val="13"/>
+              </w:rPr>
+              <w:t>0.9940</w:t>
+            </w:r>
+          </w:p>
+        </w:tc>
+        <w:tc>
+          <w:tcPr>
+            <w:tcW w:type="dxa" w:w="752"/>
+          </w:tcPr>
+          <w:p>
+            <w:pPr>
+              <w:spacing w:before="20" w:after="20"/>
+              <w:jc w:val="center"/>
+            </w:pPr>
+            <w:r/>
+            <w:r>
+              <w:rPr>
+                <w:rFonts w:ascii="Times New Roman" w:hAnsi="Times New Roman" w:eastAsia="Times New Roman"/>
+                <w:b w:val="0"/>
+                <w:sz w:val="13"/>
+              </w:rPr>
+              <w:t>0.9940</w:t>
+            </w:r>
+          </w:p>
+        </w:tc>
+        <w:tc>
+          <w:tcPr>
+            <w:tcW w:type="dxa" w:w="752"/>
+          </w:tcPr>
+          <w:p>
+            <w:pPr>
+              <w:spacing w:before="20" w:after="20"/>
+              <w:jc w:val="center"/>
+            </w:pPr>
+            <w:r/>
+            <w:r>
+              <w:rPr>
+                <w:rFonts w:ascii="Times New Roman" w:hAnsi="Times New Roman" w:eastAsia="Times New Roman"/>
+                <w:b w:val="0"/>
+                <w:sz w:val="13"/>
+              </w:rPr>
+              <w:t>0.9972</w:t>
+            </w:r>
+          </w:p>
+        </w:tc>
+        <w:tc>
+          <w:tcPr>
+            <w:tcW w:type="dxa" w:w="752"/>
+          </w:tcPr>
+          <w:p>
+            <w:pPr>
+              <w:spacing w:before="20" w:after="20"/>
+              <w:jc w:val="center"/>
+            </w:pPr>
+            <w:r/>
+            <w:r>
+              <w:rPr>
+                <w:rFonts w:ascii="Times New Roman" w:hAnsi="Times New Roman" w:eastAsia="Times New Roman"/>
+                <w:b w:val="0"/>
+                <w:sz w:val="13"/>
+              </w:rPr>
+              <w:t>0.9972</w:t>
+            </w:r>
+          </w:p>
+        </w:tc>
+        <w:tc>
+          <w:tcPr>
+            <w:tcW w:type="dxa" w:w="752"/>
+          </w:tcPr>
+          <w:p>
+            <w:pPr>
+              <w:spacing w:before="20" w:after="20"/>
+              <w:jc w:val="center"/>
+            </w:pPr>
+            <w:r/>
+            <w:r>
+              <w:rPr>
+                <w:rFonts w:ascii="Times New Roman" w:hAnsi="Times New Roman" w:eastAsia="Times New Roman"/>
+                <w:b w:val="0"/>
+                <w:sz w:val="13"/>
+              </w:rPr>
+              <w:t>0.9972</w:t>
+            </w:r>
+          </w:p>
+        </w:tc>
+        <w:tc>
+          <w:tcPr>
+            <w:tcW w:type="dxa" w:w="752"/>
+          </w:tcPr>
+          <w:p>
+            <w:pPr>
+              <w:spacing w:before="20" w:after="20"/>
+              <w:jc w:val="center"/>
+            </w:pPr>
+            <w:r/>
+            <w:r>
+              <w:rPr>
+                <w:rFonts w:ascii="Times New Roman" w:hAnsi="Times New Roman" w:eastAsia="Times New Roman"/>
+                <w:b w:val="0"/>
+                <w:sz w:val="13"/>
+              </w:rPr>
+              <w:t>0.9972</w:t>
+            </w:r>
+          </w:p>
+        </w:tc>
+      </w:tr>
+      <w:tr>
+        <w:trPr>
+          <w:cantSplit w:val="true"/>
+        </w:trPr>
+        <w:tc>
+          <w:tcPr>
+            <w:tcW w:type="dxa" w:w="752"/>
+            <w:vMerge/>
+          </w:tcPr>
+          <w:p/>
+        </w:tc>
+        <w:tc>
+          <w:tcPr>
+            <w:tcW w:type="dxa" w:w="752"/>
+          </w:tcPr>
+          <w:p>
+            <w:pPr>
+              <w:spacing w:before="20" w:after="20"/>
+              <w:jc w:val="center"/>
+            </w:pPr>
+            <w:r/>
+            <w:r>
+              <w:rPr>
+                <w:rFonts w:ascii="Times New Roman" w:hAnsi="Times New Roman" w:eastAsia="Times New Roman"/>
+                <w:b w:val="0"/>
+                <w:sz w:val="13"/>
+              </w:rPr>
+              <w:t>0.00002</w:t>
+            </w:r>
+          </w:p>
+        </w:tc>
+        <w:tc>
+          <w:tcPr>
+            <w:tcW w:type="dxa" w:w="752"/>
+          </w:tcPr>
+          <w:p>
+            <w:pPr>
+              <w:spacing w:before="20" w:after="20"/>
+              <w:jc w:val="center"/>
+            </w:pPr>
+            <w:r/>
+            <w:r>
+              <w:rPr>
+                <w:rFonts w:ascii="Times New Roman" w:hAnsi="Times New Roman" w:eastAsia="Times New Roman"/>
+                <w:b w:val="0"/>
+                <w:sz w:val="13"/>
+              </w:rPr>
+              <w:t>32</w:t>
+            </w:r>
+          </w:p>
+        </w:tc>
+        <w:tc>
+          <w:tcPr>
+            <w:tcW w:type="dxa" w:w="752"/>
+          </w:tcPr>
+          <w:p>
+            <w:pPr>
+              <w:spacing w:before="20" w:after="20"/>
+              <w:jc w:val="center"/>
+            </w:pPr>
+            <w:r/>
+            <w:r>
+              <w:rPr>
+                <w:rFonts w:ascii="Times New Roman" w:hAnsi="Times New Roman" w:eastAsia="Times New Roman"/>
+                <w:b w:val="0"/>
+                <w:sz w:val="13"/>
+              </w:rPr>
+              <w:t>0.1</w:t>
+            </w:r>
+          </w:p>
+        </w:tc>
+        <w:tc>
+          <w:tcPr>
+            <w:tcW w:type="dxa" w:w="752"/>
+          </w:tcPr>
+          <w:p>
+            <w:pPr>
+              <w:spacing w:before="20" w:after="20"/>
+              <w:jc w:val="center"/>
+            </w:pPr>
+            <w:r/>
+            <w:r>
+              <w:rPr>
+                <w:rFonts w:ascii="Times New Roman" w:hAnsi="Times New Roman" w:eastAsia="Times New Roman"/>
+                <w:b w:val="0"/>
+                <w:sz w:val="13"/>
+              </w:rPr>
+              <w:t>0.9934</w:t>
+            </w:r>
+          </w:p>
+        </w:tc>
+        <w:tc>
+          <w:tcPr>
+            <w:tcW w:type="dxa" w:w="752"/>
+          </w:tcPr>
+          <w:p>
+            <w:pPr>
+              <w:spacing w:before="20" w:after="20"/>
+              <w:jc w:val="center"/>
+            </w:pPr>
+            <w:r/>
+            <w:r>
+              <w:rPr>
+                <w:rFonts w:ascii="Times New Roman" w:hAnsi="Times New Roman" w:eastAsia="Times New Roman"/>
+                <w:b w:val="0"/>
+                <w:sz w:val="13"/>
+              </w:rPr>
+              <w:t>0.9934</w:t>
+            </w:r>
+          </w:p>
+        </w:tc>
+        <w:tc>
+          <w:tcPr>
+            <w:tcW w:type="dxa" w:w="752"/>
+          </w:tcPr>
+          <w:p>
+            <w:pPr>
+              <w:spacing w:before="20" w:after="20"/>
+              <w:jc w:val="center"/>
+            </w:pPr>
+            <w:r/>
+            <w:r>
+              <w:rPr>
+                <w:rFonts w:ascii="Times New Roman" w:hAnsi="Times New Roman" w:eastAsia="Times New Roman"/>
+                <w:b w:val="0"/>
+                <w:sz w:val="13"/>
+              </w:rPr>
+              <w:t>0.9934</w:t>
+            </w:r>
+          </w:p>
+        </w:tc>
+        <w:tc>
+          <w:tcPr>
+            <w:tcW w:type="dxa" w:w="752"/>
+          </w:tcPr>
+          <w:p>
+            <w:pPr>
+              <w:spacing w:before="20" w:after="20"/>
+              <w:jc w:val="center"/>
+            </w:pPr>
+            <w:r/>
+            <w:r>
+              <w:rPr>
+                <w:rFonts w:ascii="Times New Roman" w:hAnsi="Times New Roman" w:eastAsia="Times New Roman"/>
+                <w:b w:val="0"/>
+                <w:sz w:val="13"/>
+              </w:rPr>
+              <w:t>0.9934</w:t>
+            </w:r>
+          </w:p>
+        </w:tc>
+        <w:tc>
+          <w:tcPr>
+            <w:tcW w:type="dxa" w:w="752"/>
+          </w:tcPr>
+          <w:p>
+            <w:pPr>
+              <w:spacing w:before="20" w:after="20"/>
+              <w:jc w:val="center"/>
+            </w:pPr>
+            <w:r/>
+            <w:r>
+              <w:rPr>
+                <w:rFonts w:ascii="Times New Roman" w:hAnsi="Times New Roman" w:eastAsia="Times New Roman"/>
+                <w:b w:val="0"/>
+                <w:sz w:val="13"/>
+              </w:rPr>
+              <w:t>0.9964</w:t>
+            </w:r>
+          </w:p>
+        </w:tc>
+        <w:tc>
+          <w:tcPr>
+            <w:tcW w:type="dxa" w:w="752"/>
+          </w:tcPr>
+          <w:p>
+            <w:pPr>
+              <w:spacing w:before="20" w:after="20"/>
+              <w:jc w:val="center"/>
+            </w:pPr>
+            <w:r/>
+            <w:r>
+              <w:rPr>
+                <w:rFonts w:ascii="Times New Roman" w:hAnsi="Times New Roman" w:eastAsia="Times New Roman"/>
+                <w:b w:val="0"/>
+                <w:sz w:val="13"/>
+              </w:rPr>
+              <w:t>0.9964</w:t>
+            </w:r>
+          </w:p>
+        </w:tc>
+        <w:tc>
+          <w:tcPr>
+            <w:tcW w:type="dxa" w:w="752"/>
+          </w:tcPr>
+          <w:p>
+            <w:pPr>
+              <w:spacing w:before="20" w:after="20"/>
+              <w:jc w:val="center"/>
+            </w:pPr>
+            <w:r/>
+            <w:r>
+              <w:rPr>
+                <w:rFonts w:ascii="Times New Roman" w:hAnsi="Times New Roman" w:eastAsia="Times New Roman"/>
+                <w:b w:val="0"/>
+                <w:sz w:val="13"/>
+              </w:rPr>
+              <w:t>0.9964</w:t>
+            </w:r>
+          </w:p>
+        </w:tc>
+        <w:tc>
+          <w:tcPr>
+            <w:tcW w:type="dxa" w:w="752"/>
+          </w:tcPr>
+          <w:p>
+            <w:pPr>
+              <w:spacing w:before="20" w:after="20"/>
+              <w:jc w:val="center"/>
+            </w:pPr>
+            <w:r/>
+            <w:r>
+              <w:rPr>
+                <w:rFonts w:ascii="Times New Roman" w:hAnsi="Times New Roman" w:eastAsia="Times New Roman"/>
+                <w:b w:val="0"/>
+                <w:sz w:val="13"/>
+              </w:rPr>
+              <w:t>0.9964</w:t>
+            </w:r>
+          </w:p>
+        </w:tc>
+      </w:tr>
+      <w:tr>
+        <w:trPr>
+          <w:cantSplit w:val="true"/>
+        </w:trPr>
+        <w:tc>
+          <w:tcPr>
+            <w:tcW w:type="dxa" w:w="752"/>
+            <w:vMerge/>
+          </w:tcPr>
+          <w:p/>
+        </w:tc>
+        <w:tc>
+          <w:tcPr>
+            <w:tcW w:type="dxa" w:w="752"/>
+          </w:tcPr>
+          <w:p>
+            <w:pPr>
+              <w:spacing w:before="20" w:after="20"/>
+              <w:jc w:val="center"/>
+            </w:pPr>
+            <w:r/>
+            <w:r>
+              <w:rPr>
+                <w:rFonts w:ascii="Times New Roman" w:hAnsi="Times New Roman" w:eastAsia="Times New Roman"/>
+                <w:b w:val="0"/>
+                <w:sz w:val="13"/>
+              </w:rPr>
+              <w:t>0.00003</w:t>
+            </w:r>
+          </w:p>
+        </w:tc>
+        <w:tc>
+          <w:tcPr>
+            <w:tcW w:type="dxa" w:w="752"/>
+          </w:tcPr>
+          <w:p>
+            <w:pPr>
+              <w:spacing w:before="20" w:after="20"/>
+              <w:jc w:val="center"/>
+            </w:pPr>
+            <w:r/>
+            <w:r>
+              <w:rPr>
+                <w:rFonts w:ascii="Times New Roman" w:hAnsi="Times New Roman" w:eastAsia="Times New Roman"/>
+                <w:b w:val="0"/>
+                <w:sz w:val="13"/>
+              </w:rPr>
+              <w:t>32</w:t>
+            </w:r>
+          </w:p>
+        </w:tc>
+        <w:tc>
+          <w:tcPr>
+            <w:tcW w:type="dxa" w:w="752"/>
+          </w:tcPr>
+          <w:p>
+            <w:pPr>
+              <w:spacing w:before="20" w:after="20"/>
+              <w:jc w:val="center"/>
+            </w:pPr>
+            <w:r/>
+            <w:r>
+              <w:rPr>
+                <w:rFonts w:ascii="Times New Roman" w:hAnsi="Times New Roman" w:eastAsia="Times New Roman"/>
+                <w:b w:val="0"/>
+                <w:sz w:val="13"/>
+              </w:rPr>
+              <w:t>0.1</w:t>
+            </w:r>
+          </w:p>
+        </w:tc>
+        <w:tc>
+          <w:tcPr>
+            <w:tcW w:type="dxa" w:w="752"/>
+          </w:tcPr>
+          <w:p>
+            <w:pPr>
+              <w:spacing w:before="20" w:after="20"/>
+              <w:jc w:val="center"/>
+            </w:pPr>
+            <w:r/>
+            <w:r>
+              <w:rPr>
+                <w:rFonts w:ascii="Times New Roman" w:hAnsi="Times New Roman" w:eastAsia="Times New Roman"/>
+                <w:b w:val="0"/>
+                <w:sz w:val="13"/>
+              </w:rPr>
+              <w:t>0.9949</w:t>
+            </w:r>
+          </w:p>
+        </w:tc>
+        <w:tc>
+          <w:tcPr>
+            <w:tcW w:type="dxa" w:w="752"/>
+          </w:tcPr>
+          <w:p>
+            <w:pPr>
+              <w:spacing w:before="20" w:after="20"/>
+              <w:jc w:val="center"/>
+            </w:pPr>
+            <w:r/>
+            <w:r>
+              <w:rPr>
+                <w:rFonts w:ascii="Times New Roman" w:hAnsi="Times New Roman" w:eastAsia="Times New Roman"/>
+                <w:b w:val="0"/>
+                <w:sz w:val="13"/>
+              </w:rPr>
+              <w:t>0.9949</w:t>
+            </w:r>
+          </w:p>
+        </w:tc>
+        <w:tc>
+          <w:tcPr>
+            <w:tcW w:type="dxa" w:w="752"/>
+          </w:tcPr>
+          <w:p>
+            <w:pPr>
+              <w:spacing w:before="20" w:after="20"/>
+              <w:jc w:val="center"/>
+            </w:pPr>
+            <w:r/>
+            <w:r>
+              <w:rPr>
+                <w:rFonts w:ascii="Times New Roman" w:hAnsi="Times New Roman" w:eastAsia="Times New Roman"/>
+                <w:b w:val="0"/>
+                <w:sz w:val="13"/>
+              </w:rPr>
+              <w:t>0.9949</w:t>
+            </w:r>
+          </w:p>
+        </w:tc>
+        <w:tc>
+          <w:tcPr>
+            <w:tcW w:type="dxa" w:w="752"/>
+          </w:tcPr>
+          <w:p>
+            <w:pPr>
+              <w:spacing w:before="20" w:after="20"/>
+              <w:jc w:val="center"/>
+            </w:pPr>
+            <w:r/>
+            <w:r>
+              <w:rPr>
+                <w:rFonts w:ascii="Times New Roman" w:hAnsi="Times New Roman" w:eastAsia="Times New Roman"/>
+                <w:b w:val="0"/>
+                <w:sz w:val="13"/>
+              </w:rPr>
+              <w:t>0.9949</w:t>
+            </w:r>
+          </w:p>
+        </w:tc>
+        <w:tc>
+          <w:tcPr>
+            <w:tcW w:type="dxa" w:w="752"/>
+          </w:tcPr>
+          <w:p>
+            <w:pPr>
+              <w:spacing w:before="20" w:after="20"/>
+              <w:jc w:val="center"/>
+            </w:pPr>
+            <w:r/>
+            <w:r>
+              <w:rPr>
+                <w:rFonts w:ascii="Times New Roman" w:hAnsi="Times New Roman" w:eastAsia="Times New Roman"/>
+                <w:b w:val="0"/>
+                <w:sz w:val="13"/>
+              </w:rPr>
+              <w:t>0.9966</w:t>
+            </w:r>
+          </w:p>
+        </w:tc>
+        <w:tc>
+          <w:tcPr>
+            <w:tcW w:type="dxa" w:w="752"/>
+          </w:tcPr>
+          <w:p>
+            <w:pPr>
+              <w:spacing w:before="20" w:after="20"/>
+              <w:jc w:val="center"/>
+            </w:pPr>
+            <w:r/>
+            <w:r>
+              <w:rPr>
+                <w:rFonts w:ascii="Times New Roman" w:hAnsi="Times New Roman" w:eastAsia="Times New Roman"/>
+                <w:b w:val="0"/>
+                <w:sz w:val="13"/>
+              </w:rPr>
+              <w:t>0.9967</w:t>
+            </w:r>
+          </w:p>
+        </w:tc>
+        <w:tc>
+          <w:tcPr>
+            <w:tcW w:type="dxa" w:w="752"/>
+          </w:tcPr>
+          <w:p>
+            <w:pPr>
+              <w:spacing w:before="20" w:after="20"/>
+              <w:jc w:val="center"/>
+            </w:pPr>
+            <w:r/>
+            <w:r>
+              <w:rPr>
+                <w:rFonts w:ascii="Times New Roman" w:hAnsi="Times New Roman" w:eastAsia="Times New Roman"/>
+                <w:b w:val="0"/>
+                <w:sz w:val="13"/>
+              </w:rPr>
+              <w:t>0.9966</w:t>
+            </w:r>
+          </w:p>
+        </w:tc>
+        <w:tc>
+          <w:tcPr>
+            <w:tcW w:type="dxa" w:w="752"/>
+          </w:tcPr>
+          <w:p>
+            <w:pPr>
+              <w:spacing w:before="20" w:after="20"/>
+              <w:jc w:val="center"/>
+            </w:pPr>
+            <w:r/>
+            <w:r>
+              <w:rPr>
+                <w:rFonts w:ascii="Times New Roman" w:hAnsi="Times New Roman" w:eastAsia="Times New Roman"/>
+                <w:b w:val="0"/>
+                <w:sz w:val="13"/>
+              </w:rPr>
+              <w:t>0.9966</w:t>
+            </w:r>
+          </w:p>
+        </w:tc>
+      </w:tr>
+      <w:tr>
+        <w:trPr>
+          <w:cantSplit w:val="true"/>
+        </w:trPr>
+        <w:tc>
+          <w:tcPr>
+            <w:tcW w:type="dxa" w:w="752"/>
+          </w:tcPr>
+          <w:p>
+            <w:pPr>
+              <w:spacing w:before="20" w:after="20"/>
+              <w:jc w:val="center"/>
+            </w:pPr>
+            <w:r>
+              <w:rPr>
+                <w:rFonts w:ascii="Times New Roman" w:hAnsi="Times New Roman" w:eastAsia="Times New Roman"/>
+                <w:b/>
+                <w:sz w:val="13"/>
+              </w:rPr>
+              <w:t>ENSEMBLE</w:t>
+            </w:r>
+          </w:p>
+        </w:tc>
+        <w:tc>
+          <w:tcPr>
+            <w:tcW w:type="dxa" w:w="2256"/>
+            <w:gridSpan w:val="3"/>
+          </w:tcPr>
+          <w:p>
+            <w:pPr>
+              <w:spacing w:before="20" w:after="20"/>
+              <w:jc w:val="center"/>
+            </w:pPr>
+            <w:r>
+              <w:rPr>
+                <w:rFonts w:ascii="Times New Roman" w:hAnsi="Times New Roman" w:eastAsia="Times New Roman"/>
+                <w:b w:val="0"/>
+                <w:sz w:val="13"/>
+              </w:rPr>
+              <w:t>(validation-selected weight)</w:t>
+            </w:r>
+          </w:p>
+        </w:tc>
+        <w:tc>
+          <w:tcPr>
+            <w:tcW w:type="dxa" w:w="752"/>
+          </w:tcPr>
+          <w:p>
+            <w:pPr>
+              <w:spacing w:before="20" w:after="20"/>
+              <w:jc w:val="center"/>
+            </w:pPr>
+            <w:r/>
+            <w:r>
+              <w:rPr>
+                <w:rFonts w:ascii="Times New Roman" w:hAnsi="Times New Roman" w:eastAsia="Times New Roman"/>
+                <w:b w:val="0"/>
+                <w:sz w:val="13"/>
+              </w:rPr>
+              <w:t>0.9936</w:t>
+            </w:r>
+          </w:p>
+        </w:tc>
+        <w:tc>
+          <w:tcPr>
+            <w:tcW w:type="dxa" w:w="752"/>
+          </w:tcPr>
+          <w:p>
+            <w:pPr>
+              <w:spacing w:before="20" w:after="20"/>
+              <w:jc w:val="center"/>
+            </w:pPr>
+            <w:r/>
+            <w:r>
+              <w:rPr>
+                <w:rFonts w:ascii="Times New Roman" w:hAnsi="Times New Roman" w:eastAsia="Times New Roman"/>
+                <w:b w:val="0"/>
+                <w:sz w:val="13"/>
+              </w:rPr>
+              <w:t>0.9936</w:t>
+            </w:r>
+          </w:p>
+        </w:tc>
+        <w:tc>
+          <w:tcPr>
+            <w:tcW w:type="dxa" w:w="752"/>
+          </w:tcPr>
+          <w:p>
+            <w:pPr>
+              <w:spacing w:before="20" w:after="20"/>
+              <w:jc w:val="center"/>
+            </w:pPr>
+            <w:r/>
+            <w:r>
+              <w:rPr>
+                <w:rFonts w:ascii="Times New Roman" w:hAnsi="Times New Roman" w:eastAsia="Times New Roman"/>
+                <w:b w:val="0"/>
+                <w:sz w:val="13"/>
+              </w:rPr>
+              <w:t>0.9936</w:t>
+            </w:r>
+          </w:p>
+        </w:tc>
+        <w:tc>
+          <w:tcPr>
+            <w:tcW w:type="dxa" w:w="752"/>
+          </w:tcPr>
+          <w:p>
+            <w:pPr>
+              <w:spacing w:before="20" w:after="20"/>
+              <w:jc w:val="center"/>
+            </w:pPr>
+            <w:r/>
+            <w:r>
+              <w:rPr>
+                <w:rFonts w:ascii="Times New Roman" w:hAnsi="Times New Roman" w:eastAsia="Times New Roman"/>
+                <w:b w:val="0"/>
+                <w:sz w:val="13"/>
+              </w:rPr>
+              <w:t>0.9936</w:t>
+            </w:r>
+          </w:p>
+        </w:tc>
+        <w:tc>
+          <w:tcPr>
+            <w:tcW w:type="dxa" w:w="752"/>
+          </w:tcPr>
+          <w:p>
+            <w:pPr>
+              <w:spacing w:before="20" w:after="20"/>
+              <w:jc w:val="center"/>
+            </w:pPr>
+            <w:r/>
+            <w:r>
+              <w:rPr>
+                <w:rFonts w:ascii="Times New Roman" w:hAnsi="Times New Roman" w:eastAsia="Times New Roman"/>
+                <w:b w:val="0"/>
+                <w:sz w:val="13"/>
+              </w:rPr>
+              <w:t>0.9972</w:t>
+            </w:r>
+          </w:p>
+        </w:tc>
+        <w:tc>
+          <w:tcPr>
+            <w:tcW w:type="dxa" w:w="752"/>
+          </w:tcPr>
+          <w:p>
+            <w:pPr>
+              <w:spacing w:before="20" w:after="20"/>
+              <w:jc w:val="center"/>
+            </w:pPr>
+            <w:r/>
+            <w:r>
+              <w:rPr>
+                <w:rFonts w:ascii="Times New Roman" w:hAnsi="Times New Roman" w:eastAsia="Times New Roman"/>
+                <w:b w:val="0"/>
+                <w:sz w:val="13"/>
+              </w:rPr>
+              <w:t>0.9972</w:t>
+            </w:r>
+          </w:p>
+        </w:tc>
+        <w:tc>
+          <w:tcPr>
+            <w:tcW w:type="dxa" w:w="752"/>
+          </w:tcPr>
+          <w:p>
+            <w:pPr>
+              <w:spacing w:before="20" w:after="20"/>
+              <w:jc w:val="center"/>
+            </w:pPr>
+            <w:r/>
+            <w:r>
+              <w:rPr>
+                <w:rFonts w:ascii="Times New Roman" w:hAnsi="Times New Roman" w:eastAsia="Times New Roman"/>
+                <w:b w:val="0"/>
+                <w:sz w:val="13"/>
+              </w:rPr>
+              <w:t>0.9972</w:t>
+            </w:r>
+          </w:p>
+        </w:tc>
+        <w:tc>
+          <w:tcPr>
+            <w:tcW w:type="dxa" w:w="752"/>
+          </w:tcPr>
+          <w:p>
+            <w:pPr>
+              <w:spacing w:before="20" w:after="20"/>
+              <w:jc w:val="center"/>
+            </w:pPr>
+            <w:r/>
+            <w:r>
+              <w:rPr>
+                <w:rFonts w:ascii="Times New Roman" w:hAnsi="Times New Roman" w:eastAsia="Times New Roman"/>
+                <w:b w:val="0"/>
+                <w:sz w:val="13"/>
+              </w:rPr>
+              <w:t>0.9972</w:t>
+            </w:r>
+          </w:p>
+        </w:tc>
+      </w:tr>
+    </w:tbl>
+    <w:p>
+      <w:pPr>
+        <w:keepNext/>
+      </w:pPr>
+      <w:r>
+        <w:rPr>
+          <w:rFonts w:ascii="Times New Roman" w:hAnsi="Times New Roman" w:eastAsia="Times New Roman"/>
+          <w:b w:val="0"/>
+          <w:sz w:val="20"/>
+        </w:rPr>
+        <w:t>Table 7. Final comparison. Every row comes from the full balanced corpora and the same fixed split. Each classical row is shown with whichever text representation performed better on that dataset, which the Rep. column names. The transformers read raw text, so no representation applies to them. The ENSEMBLE row uses the weight chosen on validation.</w:t>
       </w:r>
     </w:p>
     <w:tbl>

</xml_diff>

<commit_message>
NLP final report: use one representation per classical model across both datasets
Sir's note (relayed by Niloy): a classical model should use the same text
representation on both datasets rather than whichever wins per dataset. Naive
Bayes and Logistic Regression already agreed on BoW either way. The Support
Vector Machine did not, TF-IDF wins DAIGT V2 and BoW wins HC3 by a per-dataset
comparison, so its Table 7 row now picks whichever representation wins by
summed F1 across both datasets (TF-IDF, by 0.0014), shown as a single
"[TF-IDF]" tag rather than a per-dataset D1/D2 split.
</commit_message>
<xml_diff>
--- a/docs/NLP Final Report - Group 02 Section B.docx
+++ b/docs/NLP Final Report - Group 02 Section B.docx
@@ -9316,7 +9316,7 @@
           <w:b w:val="0"/>
           <w:sz w:val="24"/>
         </w:rPr>
-        <w:t>This section brings together sir's two required tables. Table 6 is the full sweep, all eight configurations of BERT and DeBERTa on both datasets plus the ensemble, moved here from the per-model sections so the whole grid can be read in one place. Table 7 below it is the final six-row comparison, one row per model family at its best setting; each classical model name carries its winning representation directly, for example "Naive Bayes [BoW]", instead of a separate Representation column, since the representation choice differs between the two datasets and a shared column would force one label to serve both.</w:t>
+        <w:t>This section brings together sir's two required tables. Table 6 is the full sweep, all eight configurations of BERT and DeBERTa on both datasets plus the ensemble, moved here from the per-model sections so the whole grid can be read in one place. Table 7 below it is the final six-row comparison, one row per model family at its best setting; each classical model name carries its winning representation directly, for example "Naive Bayes [BoW]", instead of a separate Representation column. Each classical model uses the same representation on both datasets, chosen by summed F1 across the two, so a model is never shown at one representation on DAIGT V2 and a different one on HC3. Naive Bayes and Logistic Regression both land on BoW under this rule, unchanged from picking per dataset. The Support Vector Machine does not, per dataset TF-IDF wins on DAIGT V2 and BoW wins on HC3, and summed F1 favours TF-IDF by 0.0014, so the SVM row uses TF-IDF on both datasets, 0.0026 F1 short of BoW's HC3 score rather than at BoW's HC3 best.</w:t>
       </w:r>
     </w:p>
     <w:p>
@@ -13628,7 +13628,7 @@
           <w:b w:val="0"/>
           <w:sz w:val="24"/>
         </w:rPr>
-        <w:t>Across Table 7's six rows, the best on DAIGT V2 is ENSEMBLE at 0.9936 F1, the worst is Naive Bayes [BoW] at 0.9591, mean 0.9860. On HC3 the best is DeBERTa (BERT variant) at 0.9972, the worst is Naive Bayes [BoW] at 0.8713, mean 0.9600. DeBERTa is best on both because disentangled attention and a replaced-token-detection pretraining objective give it a genuine edge on HC3's formatting-carried signal, discussed below, while on DAIGT V2 it merely ties the classical ceiling rather than beating it. Naive Bayes is worst on both for the same independence-assumption reason given in Section 2, and it stays worst even after being allowed its better representation.</w:t>
+        <w:t>Across Table 7's six rows, the best on DAIGT V2 is ENSEMBLE at 0.9936 F1, the worst is Naive Bayes [BoW] at 0.9591, mean 0.9860. On HC3 the best is DeBERTa (BERT variant) at 0.9972, the worst is Naive Bayes [BoW] at 0.8713, mean 0.9596. DeBERTa is best on both because disentangled attention and a replaced-token-detection pretraining objective give it a genuine edge on HC3's formatting-carried signal, discussed below, while on DAIGT V2 it merely ties the classical ceiling rather than beating it. Naive Bayes is worst on both for the same independence-assumption reason given in Section 2, and it stays worst even after being allowed its better representation.</w:t>
       </w:r>
     </w:p>
     <w:p>
@@ -13641,7 +13641,7 @@
           <w:b w:val="0"/>
           <w:sz w:val="20"/>
         </w:rPr>
-        <w:t>Table 7. Final comparison, six rows. Every row comes from the full balanced corpora and the same fixed split. Each classical model name carries its winning text representation directly, e.g. "Naive Bayes [BoW]", since the winning representation differs by dataset. The ENSEMBLE row uses the weight chosen on validation.</w:t>
+        <w:t>Table 7. Final comparison, six rows. Every row comes from the full balanced corpora and the same fixed split. Each classical model name carries the text representation it uses, e.g. "Naive Bayes [BoW]", the same representation on both datasets for that model, chosen by summed F1 across the two. The ENSEMBLE row uses the weight chosen on validation.</w:t>
       </w:r>
     </w:p>
     <w:tbl>
@@ -13921,7 +13921,7 @@
                 <w:b w:val="0"/>
                 <w:sz w:val="14"/>
               </w:rPr>
-              <w:t>Naive Bayes [D1: BoW / D2: BoW]</w:t>
+              <w:t>Naive Bayes [BoW]</w:t>
             </w:r>
           </w:p>
         </w:tc>
@@ -14106,7 +14106,7 @@
                 <w:b w:val="0"/>
                 <w:sz w:val="14"/>
               </w:rPr>
-              <w:t>Logistic Regression [D1: BoW / D2: BoW]</w:t>
+              <w:t>Logistic Regression [BoW]</w:t>
             </w:r>
           </w:p>
         </w:tc>
@@ -14291,7 +14291,7 @@
                 <w:b w:val="0"/>
                 <w:sz w:val="14"/>
               </w:rPr>
-              <w:t>Support Vector Machine [D1: TF-IDF / D2: BoW]</w:t>
+              <w:t>Support Vector Machine [TF-IDF]</w:t>
             </w:r>
           </w:p>
         </w:tc>
@@ -14391,7 +14391,7 @@
                 <w:b w:val="0"/>
                 <w:sz w:val="14"/>
               </w:rPr>
-              <w:t>0.9475</w:t>
+              <w:t>0.9449</w:t>
             </w:r>
           </w:p>
         </w:tc>
@@ -14411,7 +14411,7 @@
                 <w:b w:val="0"/>
                 <w:sz w:val="14"/>
               </w:rPr>
-              <w:t>0.9476</w:t>
+              <w:t>0.9452</w:t>
             </w:r>
           </w:p>
         </w:tc>
@@ -14431,7 +14431,7 @@
                 <w:b w:val="0"/>
                 <w:sz w:val="14"/>
               </w:rPr>
-              <w:t>0.9475</w:t>
+              <w:t>0.9449</w:t>
             </w:r>
           </w:p>
         </w:tc>
@@ -14451,7 +14451,7 @@
                 <w:b w:val="0"/>
                 <w:sz w:val="14"/>
               </w:rPr>
-              <w:t>0.9475</w:t>
+              <w:t>0.9449</w:t>
             </w:r>
           </w:p>
         </w:tc>

</xml_diff>